<commit_message>
docs: add how to run project section to solution brief docx
</commit_message>
<xml_diff>
--- a/AI/ChatbotOCR/SOLUTION_BRIEF.docx
+++ b/AI/ChatbotOCR/SOLUTION_BRIEF.docx
@@ -13,7 +13,7 @@
           <w:color w:val="000000"/>
           <w:sz w:val="36"/>
         </w:rPr>
-        <w:t>Support Screenshot Chatbot: End-to-End Pipeline</w:t>
+        <w:t>Support Screenshot Chatbot: End-to-End Pipeline &amp; Execution Guide</w:t>
       </w:r>
     </w:p>
     <w:p>
@@ -27,7 +27,7 @@
           <w:color w:val="000000"/>
           <w:sz w:val="22"/>
         </w:rPr>
-        <w:t>Project Overview and Step-by-Step Processing Flow</w:t>
+        <w:t>Project Overview, Step-by-Step Processing Flow, and How to Run the Application</w:t>
       </w:r>
     </w:p>
     <w:tbl>
@@ -390,7 +390,7 @@
           <w:color w:val="000000"/>
           <w:sz w:val="21"/>
         </w:rPr>
-        <w:t>The pipeline processes each user request through five clear, sequential stages from upload to response:</w:t>
+        <w:t>The pipeline processes each user request through six clear, sequential stages from upload to response:</w:t>
       </w:r>
     </w:p>
     <w:p>
@@ -1529,7 +1529,7 @@
           <w:color w:val="000000"/>
           <w:sz w:val="21"/>
         </w:rPr>
-        <w:t>The pipeline choices prioritize three critical requirements: accuracy, privacy, and speed:</w:t>
+        <w:t>The pipeline choices prioritize four critical engineering goals: accuracy, privacy, zero infrastructure, and low latency:</w:t>
       </w:r>
     </w:p>
     <w:p>
@@ -1636,7 +1636,843 @@
           <w:color w:val="000000"/>
           <w:sz w:val="26"/>
         </w:rPr>
-        <w:t>5. Verification &amp; Testing</w:t>
+        <w:t>5. How to Run This Project</w:t>
+      </w:r>
+    </w:p>
+    <w:p>
+      <w:pPr>
+        <w:spacing w:before="0" w:after="80" w:line="276" w:lineRule="auto"/>
+      </w:pPr>
+      <w:r>
+        <w:rPr>
+          <w:rFonts w:ascii="Calibri" w:hAnsi="Calibri"/>
+          <w:color w:val="000000"/>
+          <w:sz w:val="21"/>
+        </w:rPr>
+        <w:t>The project is packaged with a unified CLI entrypoint (main.py) and a FastAPI web server, enabling straightforward setup and execution.</w:t>
+      </w:r>
+    </w:p>
+    <w:p>
+      <w:pPr>
+        <w:keepNext/>
+        <w:spacing w:before="200" w:after="60"/>
+      </w:pPr>
+      <w:r>
+        <w:rPr>
+          <w:rFonts w:ascii="Calibri" w:hAnsi="Calibri"/>
+          <w:b/>
+          <w:color w:val="000000"/>
+          <w:sz w:val="23"/>
+        </w:rPr>
+        <w:t>5.1 Prerequisites &amp; Environment Setup</w:t>
+      </w:r>
+    </w:p>
+    <w:p>
+      <w:pPr>
+        <w:spacing w:before="0" w:after="80" w:line="276" w:lineRule="auto"/>
+      </w:pPr>
+      <w:r>
+        <w:rPr>
+          <w:rFonts w:ascii="Calibri" w:hAnsi="Calibri"/>
+          <w:color w:val="000000"/>
+          <w:sz w:val="21"/>
+        </w:rPr>
+        <w:t>1. Clone the repository and enter the project directory:</w:t>
+      </w:r>
+    </w:p>
+    <w:tbl>
+      <w:tblPr>
+        <w:tblW w:type="auto" w:w="0"/>
+        <w:jc w:val="center"/>
+        <w:tblLayout w:type="fixed"/>
+        <w:tblLook w:firstColumn="1" w:firstRow="1" w:lastColumn="0" w:lastRow="0" w:noHBand="0" w:noVBand="1" w:val="04A0"/>
+      </w:tblPr>
+      <w:tblGrid>
+        <w:gridCol w:w="9360"/>
+      </w:tblGrid>
+      <w:tr>
+        <w:tc>
+          <w:tcPr>
+            <w:tcW w:type="dxa" w:w="10080"/>
+            <w:shd w:fill="F3F4F6"/>
+            <w:tcMar>
+              <w:top w:w="60" w:type="dxa"/>
+              <w:bottom w:w="60" w:type="dxa"/>
+              <w:left w:w="120" w:type="dxa"/>
+              <w:right w:w="120" w:type="dxa"/>
+            </w:tcMar>
+            <w:tcBorders>
+              <w:top w:val="single" w:sz="4" w:space="0" w:color="CCCCCC"/>
+              <w:left w:val="single" w:sz="4" w:space="0" w:color="CCCCCC"/>
+              <w:bottom w:val="single" w:sz="4" w:space="0" w:color="CCCCCC"/>
+              <w:right w:val="single" w:sz="4" w:space="0" w:color="CCCCCC"/>
+            </w:tcBorders>
+          </w:tcPr>
+          <w:p>
+            <w:pPr>
+              <w:spacing w:before="40" w:after="40"/>
+            </w:pPr>
+            <w:r>
+              <w:rPr>
+                <w:rFonts w:ascii="Consolas" w:hAnsi="Consolas"/>
+                <w:color w:val="000000"/>
+                <w:sz w:val="18"/>
+              </w:rPr>
+              <w:t>git clone https://github.com/NVKQ2022/MVP.git</w:t>
+              <w:br/>
+              <w:t>cd MVP/AI/ChatbotOCR</w:t>
+            </w:r>
+          </w:p>
+        </w:tc>
+      </w:tr>
+    </w:tbl>
+    <w:p>
+      <w:pPr>
+        <w:spacing w:after="40"/>
+      </w:pPr>
+    </w:p>
+    <w:p>
+      <w:pPr>
+        <w:spacing w:before="0" w:after="80" w:line="276" w:lineRule="auto"/>
+      </w:pPr>
+      <w:r>
+        <w:rPr>
+          <w:rFonts w:ascii="Calibri" w:hAnsi="Calibri"/>
+          <w:color w:val="000000"/>
+          <w:sz w:val="21"/>
+        </w:rPr>
+        <w:t>2. Create and activate a Python virtual environment (Python 3.10+ or 3.12):</w:t>
+      </w:r>
+    </w:p>
+    <w:tbl>
+      <w:tblPr>
+        <w:tblW w:type="auto" w:w="0"/>
+        <w:jc w:val="center"/>
+        <w:tblLayout w:type="fixed"/>
+        <w:tblLook w:firstColumn="1" w:firstRow="1" w:lastColumn="0" w:lastRow="0" w:noHBand="0" w:noVBand="1" w:val="04A0"/>
+      </w:tblPr>
+      <w:tblGrid>
+        <w:gridCol w:w="9360"/>
+      </w:tblGrid>
+      <w:tr>
+        <w:tc>
+          <w:tcPr>
+            <w:tcW w:type="dxa" w:w="10080"/>
+            <w:shd w:fill="F3F4F6"/>
+            <w:tcMar>
+              <w:top w:w="60" w:type="dxa"/>
+              <w:bottom w:w="60" w:type="dxa"/>
+              <w:left w:w="120" w:type="dxa"/>
+              <w:right w:w="120" w:type="dxa"/>
+            </w:tcMar>
+            <w:tcBorders>
+              <w:top w:val="single" w:sz="4" w:space="0" w:color="CCCCCC"/>
+              <w:left w:val="single" w:sz="4" w:space="0" w:color="CCCCCC"/>
+              <w:bottom w:val="single" w:sz="4" w:space="0" w:color="CCCCCC"/>
+              <w:right w:val="single" w:sz="4" w:space="0" w:color="CCCCCC"/>
+            </w:tcBorders>
+          </w:tcPr>
+          <w:p>
+            <w:pPr>
+              <w:spacing w:before="40" w:after="40"/>
+            </w:pPr>
+            <w:r>
+              <w:rPr>
+                <w:rFonts w:ascii="Consolas" w:hAnsi="Consolas"/>
+                <w:color w:val="000000"/>
+                <w:sz w:val="18"/>
+              </w:rPr>
+              <w:t>python3 -m venv venv</w:t>
+              <w:br/>
+              <w:t>source venv/bin/activate    # On Windows: venv\Scripts\activate</w:t>
+            </w:r>
+          </w:p>
+        </w:tc>
+      </w:tr>
+    </w:tbl>
+    <w:p>
+      <w:pPr>
+        <w:spacing w:after="40"/>
+      </w:pPr>
+    </w:p>
+    <w:p>
+      <w:pPr>
+        <w:spacing w:before="0" w:after="80" w:line="276" w:lineRule="auto"/>
+      </w:pPr>
+      <w:r>
+        <w:rPr>
+          <w:rFonts w:ascii="Calibri" w:hAnsi="Calibri"/>
+          <w:color w:val="000000"/>
+          <w:sz w:val="21"/>
+        </w:rPr>
+        <w:t>3. Install the project dependencies:</w:t>
+      </w:r>
+    </w:p>
+    <w:tbl>
+      <w:tblPr>
+        <w:tblW w:type="auto" w:w="0"/>
+        <w:jc w:val="center"/>
+        <w:tblLayout w:type="fixed"/>
+        <w:tblLook w:firstColumn="1" w:firstRow="1" w:lastColumn="0" w:lastRow="0" w:noHBand="0" w:noVBand="1" w:val="04A0"/>
+      </w:tblPr>
+      <w:tblGrid>
+        <w:gridCol w:w="9360"/>
+      </w:tblGrid>
+      <w:tr>
+        <w:tc>
+          <w:tcPr>
+            <w:tcW w:type="dxa" w:w="10080"/>
+            <w:shd w:fill="F3F4F6"/>
+            <w:tcMar>
+              <w:top w:w="60" w:type="dxa"/>
+              <w:bottom w:w="60" w:type="dxa"/>
+              <w:left w:w="120" w:type="dxa"/>
+              <w:right w:w="120" w:type="dxa"/>
+            </w:tcMar>
+            <w:tcBorders>
+              <w:top w:val="single" w:sz="4" w:space="0" w:color="CCCCCC"/>
+              <w:left w:val="single" w:sz="4" w:space="0" w:color="CCCCCC"/>
+              <w:bottom w:val="single" w:sz="4" w:space="0" w:color="CCCCCC"/>
+              <w:right w:val="single" w:sz="4" w:space="0" w:color="CCCCCC"/>
+            </w:tcBorders>
+          </w:tcPr>
+          <w:p>
+            <w:pPr>
+              <w:spacing w:before="40" w:after="40"/>
+            </w:pPr>
+            <w:r>
+              <w:rPr>
+                <w:rFonts w:ascii="Consolas" w:hAnsi="Consolas"/>
+                <w:color w:val="000000"/>
+                <w:sz w:val="18"/>
+              </w:rPr>
+              <w:t>pip install -r requirements.txt</w:t>
+            </w:r>
+          </w:p>
+        </w:tc>
+      </w:tr>
+    </w:tbl>
+    <w:p>
+      <w:pPr>
+        <w:spacing w:after="40"/>
+      </w:pPr>
+    </w:p>
+    <w:p>
+      <w:pPr>
+        <w:spacing w:before="0" w:after="80" w:line="276" w:lineRule="auto"/>
+      </w:pPr>
+      <w:r>
+        <w:rPr>
+          <w:rFonts w:ascii="Calibri" w:hAnsi="Calibri"/>
+          <w:color w:val="000000"/>
+          <w:sz w:val="21"/>
+        </w:rPr>
+        <w:t>4. Configure environment variables (.env file):</w:t>
+      </w:r>
+    </w:p>
+    <w:p>
+      <w:pPr>
+        <w:spacing w:before="0" w:after="80" w:line="276" w:lineRule="auto"/>
+      </w:pPr>
+      <w:r>
+        <w:rPr>
+          <w:rFonts w:ascii="Calibri" w:hAnsi="Calibri"/>
+          <w:color w:val="000000"/>
+          <w:sz w:val="21"/>
+        </w:rPr>
+        <w:t>Copy .env.example to .env and provide your Azure OpenAI credentials (API key, endpoint, model deployment name):</w:t>
+      </w:r>
+    </w:p>
+    <w:tbl>
+      <w:tblPr>
+        <w:tblW w:type="auto" w:w="0"/>
+        <w:jc w:val="center"/>
+        <w:tblLayout w:type="fixed"/>
+        <w:tblLook w:firstColumn="1" w:firstRow="1" w:lastColumn="0" w:lastRow="0" w:noHBand="0" w:noVBand="1" w:val="04A0"/>
+      </w:tblPr>
+      <w:tblGrid>
+        <w:gridCol w:w="9360"/>
+      </w:tblGrid>
+      <w:tr>
+        <w:tc>
+          <w:tcPr>
+            <w:tcW w:type="dxa" w:w="10080"/>
+            <w:shd w:fill="F3F4F6"/>
+            <w:tcMar>
+              <w:top w:w="60" w:type="dxa"/>
+              <w:bottom w:w="60" w:type="dxa"/>
+              <w:left w:w="120" w:type="dxa"/>
+              <w:right w:w="120" w:type="dxa"/>
+            </w:tcMar>
+            <w:tcBorders>
+              <w:top w:val="single" w:sz="4" w:space="0" w:color="CCCCCC"/>
+              <w:left w:val="single" w:sz="4" w:space="0" w:color="CCCCCC"/>
+              <w:bottom w:val="single" w:sz="4" w:space="0" w:color="CCCCCC"/>
+              <w:right w:val="single" w:sz="4" w:space="0" w:color="CCCCCC"/>
+            </w:tcBorders>
+          </w:tcPr>
+          <w:p>
+            <w:pPr>
+              <w:spacing w:before="40" w:after="40"/>
+            </w:pPr>
+            <w:r>
+              <w:rPr>
+                <w:rFonts w:ascii="Consolas" w:hAnsi="Consolas"/>
+                <w:color w:val="000000"/>
+                <w:sz w:val="18"/>
+              </w:rPr>
+              <w:t>cp .env.example .env</w:t>
+              <w:br/>
+              <w:t># Edit .env with your AZURE_OPENAI_API_KEY and AZURE_OPENAI_ENDPOINT</w:t>
+            </w:r>
+          </w:p>
+        </w:tc>
+      </w:tr>
+    </w:tbl>
+    <w:p>
+      <w:pPr>
+        <w:spacing w:after="40"/>
+      </w:pPr>
+    </w:p>
+    <w:p>
+      <w:pPr>
+        <w:keepNext/>
+        <w:spacing w:before="200" w:after="60"/>
+      </w:pPr>
+      <w:r>
+        <w:rPr>
+          <w:rFonts w:ascii="Calibri" w:hAnsi="Calibri"/>
+          <w:b/>
+          <w:color w:val="000000"/>
+          <w:sz w:val="23"/>
+        </w:rPr>
+        <w:t>5.2 Starting the Web Chat Application</w:t>
+      </w:r>
+    </w:p>
+    <w:p>
+      <w:pPr>
+        <w:spacing w:before="0" w:after="80" w:line="276" w:lineRule="auto"/>
+      </w:pPr>
+      <w:r>
+        <w:rPr>
+          <w:rFonts w:ascii="Calibri" w:hAnsi="Calibri"/>
+          <w:color w:val="000000"/>
+          <w:sz w:val="21"/>
+        </w:rPr>
+        <w:t>Launch the application using the root runner:</w:t>
+      </w:r>
+    </w:p>
+    <w:tbl>
+      <w:tblPr>
+        <w:tblW w:type="auto" w:w="0"/>
+        <w:jc w:val="center"/>
+        <w:tblLayout w:type="fixed"/>
+        <w:tblLook w:firstColumn="1" w:firstRow="1" w:lastColumn="0" w:lastRow="0" w:noHBand="0" w:noVBand="1" w:val="04A0"/>
+      </w:tblPr>
+      <w:tblGrid>
+        <w:gridCol w:w="9360"/>
+      </w:tblGrid>
+      <w:tr>
+        <w:tc>
+          <w:tcPr>
+            <w:tcW w:type="dxa" w:w="10080"/>
+            <w:shd w:fill="F3F4F6"/>
+            <w:tcMar>
+              <w:top w:w="60" w:type="dxa"/>
+              <w:bottom w:w="60" w:type="dxa"/>
+              <w:left w:w="120" w:type="dxa"/>
+              <w:right w:w="120" w:type="dxa"/>
+            </w:tcMar>
+            <w:tcBorders>
+              <w:top w:val="single" w:sz="4" w:space="0" w:color="CCCCCC"/>
+              <w:left w:val="single" w:sz="4" w:space="0" w:color="CCCCCC"/>
+              <w:bottom w:val="single" w:sz="4" w:space="0" w:color="CCCCCC"/>
+              <w:right w:val="single" w:sz="4" w:space="0" w:color="CCCCCC"/>
+            </w:tcBorders>
+          </w:tcPr>
+          <w:p>
+            <w:pPr>
+              <w:spacing w:before="40" w:after="40"/>
+            </w:pPr>
+            <w:r>
+              <w:rPr>
+                <w:rFonts w:ascii="Consolas" w:hAnsi="Consolas"/>
+                <w:color w:val="000000"/>
+                <w:sz w:val="18"/>
+              </w:rPr>
+              <w:t>python main.py</w:t>
+              <w:br/>
+              <w:t># Or explicitly: python main.py server --host 0.0.0.0 --port 8000</w:t>
+            </w:r>
+          </w:p>
+        </w:tc>
+      </w:tr>
+    </w:tbl>
+    <w:p>
+      <w:pPr>
+        <w:spacing w:after="40"/>
+      </w:pPr>
+    </w:p>
+    <w:p>
+      <w:pPr>
+        <w:spacing w:before="0" w:after="80" w:line="276" w:lineRule="auto"/>
+      </w:pPr>
+      <w:r>
+        <w:rPr>
+          <w:rFonts w:ascii="Calibri" w:hAnsi="Calibri"/>
+          <w:color w:val="000000"/>
+          <w:sz w:val="21"/>
+        </w:rPr>
+        <w:t>Once started, open your web browser to:</w:t>
+      </w:r>
+    </w:p>
+    <w:p>
+      <w:pPr>
+        <w:pStyle w:val="ListBullet"/>
+        <w:spacing w:before="0" w:after="50" w:line="276" w:lineRule="auto"/>
+      </w:pPr>
+      <w:r>
+        <w:rPr>
+          <w:rFonts w:ascii="Calibri" w:hAnsi="Calibri"/>
+          <w:b/>
+          <w:color w:val="000000"/>
+          <w:sz w:val="20"/>
+        </w:rPr>
+        <w:t xml:space="preserve">Web Chat Interface: </w:t>
+      </w:r>
+      <w:r>
+        <w:rPr>
+          <w:rFonts w:ascii="Calibri" w:hAnsi="Calibri"/>
+          <w:color w:val="000000"/>
+          <w:sz w:val="20"/>
+        </w:rPr>
+        <w:t>http://localhost:8000 — Interactive single-page support chatbot UI with drag-and-drop screenshot upload.</w:t>
+      </w:r>
+    </w:p>
+    <w:p>
+      <w:pPr>
+        <w:pStyle w:val="ListBullet"/>
+        <w:spacing w:before="0" w:after="50" w:line="276" w:lineRule="auto"/>
+      </w:pPr>
+      <w:r>
+        <w:rPr>
+          <w:rFonts w:ascii="Calibri" w:hAnsi="Calibri"/>
+          <w:b/>
+          <w:color w:val="000000"/>
+          <w:sz w:val="20"/>
+        </w:rPr>
+        <w:t xml:space="preserve">API Documentation: </w:t>
+      </w:r>
+      <w:r>
+        <w:rPr>
+          <w:rFonts w:ascii="Calibri" w:hAnsi="Calibri"/>
+          <w:color w:val="000000"/>
+          <w:sz w:val="20"/>
+        </w:rPr>
+        <w:t>http://localhost:8000/docs — Interactive OpenAPI / Swagger documentation for testing REST endpoints directly.</w:t>
+      </w:r>
+    </w:p>
+    <w:p>
+      <w:pPr>
+        <w:keepNext/>
+        <w:spacing w:before="200" w:after="60"/>
+      </w:pPr>
+      <w:r>
+        <w:rPr>
+          <w:rFonts w:ascii="Calibri" w:hAnsi="Calibri"/>
+          <w:b/>
+          <w:color w:val="000000"/>
+          <w:sz w:val="23"/>
+        </w:rPr>
+        <w:t>5.3 Running End-to-End Terminal Diagnosis (CLI)</w:t>
+      </w:r>
+    </w:p>
+    <w:p>
+      <w:pPr>
+        <w:spacing w:before="0" w:after="80" w:line="276" w:lineRule="auto"/>
+      </w:pPr>
+      <w:r>
+        <w:rPr>
+          <w:rFonts w:ascii="Calibri" w:hAnsi="Calibri"/>
+          <w:color w:val="000000"/>
+          <w:sz w:val="21"/>
+        </w:rPr>
+        <w:t>You can diagnose an error screenshot directly from the terminal without opening a browser:</w:t>
+      </w:r>
+    </w:p>
+    <w:tbl>
+      <w:tblPr>
+        <w:tblW w:type="auto" w:w="0"/>
+        <w:jc w:val="center"/>
+        <w:tblLayout w:type="fixed"/>
+        <w:tblLook w:firstColumn="1" w:firstRow="1" w:lastColumn="0" w:lastRow="0" w:noHBand="0" w:noVBand="1" w:val="04A0"/>
+      </w:tblPr>
+      <w:tblGrid>
+        <w:gridCol w:w="9360"/>
+      </w:tblGrid>
+      <w:tr>
+        <w:tc>
+          <w:tcPr>
+            <w:tcW w:type="dxa" w:w="10080"/>
+            <w:shd w:fill="F3F4F6"/>
+            <w:tcMar>
+              <w:top w:w="60" w:type="dxa"/>
+              <w:bottom w:w="60" w:type="dxa"/>
+              <w:left w:w="120" w:type="dxa"/>
+              <w:right w:w="120" w:type="dxa"/>
+            </w:tcMar>
+            <w:tcBorders>
+              <w:top w:val="single" w:sz="4" w:space="0" w:color="CCCCCC"/>
+              <w:left w:val="single" w:sz="4" w:space="0" w:color="CCCCCC"/>
+              <w:bottom w:val="single" w:sz="4" w:space="0" w:color="CCCCCC"/>
+              <w:right w:val="single" w:sz="4" w:space="0" w:color="CCCCCC"/>
+            </w:tcBorders>
+          </w:tcPr>
+          <w:p>
+            <w:pPr>
+              <w:spacing w:before="40" w:after="40"/>
+            </w:pPr>
+            <w:r>
+              <w:rPr>
+                <w:rFonts w:ascii="Consolas" w:hAnsi="Consolas"/>
+                <w:color w:val="000000"/>
+                <w:sz w:val="18"/>
+              </w:rPr>
+              <w:t>python main.py diagnose data/sample_screenshots/kb-auth-001__01__clean_light.png</w:t>
+            </w:r>
+          </w:p>
+        </w:tc>
+      </w:tr>
+    </w:tbl>
+    <w:p>
+      <w:pPr>
+        <w:spacing w:after="40"/>
+      </w:pPr>
+    </w:p>
+    <w:p>
+      <w:pPr>
+        <w:spacing w:before="0" w:after="80" w:line="276" w:lineRule="auto"/>
+      </w:pPr>
+      <w:r>
+        <w:rPr>
+          <w:rFonts w:ascii="Calibri" w:hAnsi="Calibri"/>
+          <w:color w:val="000000"/>
+          <w:sz w:val="21"/>
+        </w:rPr>
+        <w:t>This command executes the full pipeline in the terminal: extracts text using PaddleOCR, searches Milvus Lite, and prints the grounded resolution along with latency and confidence metrics.</w:t>
+      </w:r>
+    </w:p>
+    <w:p>
+      <w:pPr>
+        <w:keepNext/>
+        <w:spacing w:before="200" w:after="60"/>
+      </w:pPr>
+      <w:r>
+        <w:rPr>
+          <w:rFonts w:ascii="Calibri" w:hAnsi="Calibri"/>
+          <w:b/>
+          <w:color w:val="000000"/>
+          <w:sz w:val="23"/>
+        </w:rPr>
+        <w:t>5.4 Standalone OCR and RAG Commands</w:t>
+      </w:r>
+    </w:p>
+    <w:p>
+      <w:pPr>
+        <w:pStyle w:val="ListBullet"/>
+        <w:spacing w:before="0" w:after="50" w:line="276" w:lineRule="auto"/>
+      </w:pPr>
+      <w:r>
+        <w:rPr>
+          <w:rFonts w:ascii="Calibri" w:hAnsi="Calibri"/>
+          <w:b/>
+          <w:color w:val="000000"/>
+          <w:sz w:val="20"/>
+        </w:rPr>
+        <w:t xml:space="preserve">Standalone OCR: </w:t>
+      </w:r>
+      <w:r>
+        <w:rPr>
+          <w:rFonts w:ascii="Calibri" w:hAnsi="Calibri"/>
+          <w:color w:val="000000"/>
+          <w:sz w:val="20"/>
+        </w:rPr>
+        <w:t>Run OCR on any image and optionally save annotated visual boxes:</w:t>
+      </w:r>
+    </w:p>
+    <w:tbl>
+      <w:tblPr>
+        <w:tblW w:type="auto" w:w="0"/>
+        <w:jc w:val="center"/>
+        <w:tblLayout w:type="fixed"/>
+        <w:tblLook w:firstColumn="1" w:firstRow="1" w:lastColumn="0" w:lastRow="0" w:noHBand="0" w:noVBand="1" w:val="04A0"/>
+      </w:tblPr>
+      <w:tblGrid>
+        <w:gridCol w:w="9360"/>
+      </w:tblGrid>
+      <w:tr>
+        <w:tc>
+          <w:tcPr>
+            <w:tcW w:type="dxa" w:w="10080"/>
+            <w:shd w:fill="F3F4F6"/>
+            <w:tcMar>
+              <w:top w:w="60" w:type="dxa"/>
+              <w:bottom w:w="60" w:type="dxa"/>
+              <w:left w:w="120" w:type="dxa"/>
+              <w:right w:w="120" w:type="dxa"/>
+            </w:tcMar>
+            <w:tcBorders>
+              <w:top w:val="single" w:sz="4" w:space="0" w:color="CCCCCC"/>
+              <w:left w:val="single" w:sz="4" w:space="0" w:color="CCCCCC"/>
+              <w:bottom w:val="single" w:sz="4" w:space="0" w:color="CCCCCC"/>
+              <w:right w:val="single" w:sz="4" w:space="0" w:color="CCCCCC"/>
+            </w:tcBorders>
+          </w:tcPr>
+          <w:p>
+            <w:pPr>
+              <w:spacing w:before="40" w:after="40"/>
+            </w:pPr>
+            <w:r>
+              <w:rPr>
+                <w:rFonts w:ascii="Consolas" w:hAnsi="Consolas"/>
+                <w:color w:val="000000"/>
+                <w:sz w:val="18"/>
+              </w:rPr>
+              <w:t>python main.py ocr demo_output/sample_invoice.jpg --save-annotated demo_output/result.jpg</w:t>
+            </w:r>
+          </w:p>
+        </w:tc>
+      </w:tr>
+    </w:tbl>
+    <w:p>
+      <w:pPr>
+        <w:spacing w:after="40"/>
+      </w:pPr>
+    </w:p>
+    <w:p>
+      <w:pPr>
+        <w:pStyle w:val="ListBullet"/>
+        <w:spacing w:before="0" w:after="50" w:line="276" w:lineRule="auto"/>
+      </w:pPr>
+      <w:r>
+        <w:rPr>
+          <w:rFonts w:ascii="Calibri" w:hAnsi="Calibri"/>
+          <w:b/>
+          <w:color w:val="000000"/>
+          <w:sz w:val="20"/>
+        </w:rPr>
+        <w:t xml:space="preserve">Standalone Knowledge Query: </w:t>
+      </w:r>
+      <w:r>
+        <w:rPr>
+          <w:rFonts w:ascii="Calibri" w:hAnsi="Calibri"/>
+          <w:color w:val="000000"/>
+          <w:sz w:val="20"/>
+        </w:rPr>
+        <w:t>Ask questions directly against the technical knowledge base:</w:t>
+      </w:r>
+    </w:p>
+    <w:tbl>
+      <w:tblPr>
+        <w:tblW w:type="auto" w:w="0"/>
+        <w:jc w:val="center"/>
+        <w:tblLayout w:type="fixed"/>
+        <w:tblLook w:firstColumn="1" w:firstRow="1" w:lastColumn="0" w:lastRow="0" w:noHBand="0" w:noVBand="1" w:val="04A0"/>
+      </w:tblPr>
+      <w:tblGrid>
+        <w:gridCol w:w="9360"/>
+      </w:tblGrid>
+      <w:tr>
+        <w:tc>
+          <w:tcPr>
+            <w:tcW w:type="dxa" w:w="10080"/>
+            <w:shd w:fill="F3F4F6"/>
+            <w:tcMar>
+              <w:top w:w="60" w:type="dxa"/>
+              <w:bottom w:w="60" w:type="dxa"/>
+              <w:left w:w="120" w:type="dxa"/>
+              <w:right w:w="120" w:type="dxa"/>
+            </w:tcMar>
+            <w:tcBorders>
+              <w:top w:val="single" w:sz="4" w:space="0" w:color="CCCCCC"/>
+              <w:left w:val="single" w:sz="4" w:space="0" w:color="CCCCCC"/>
+              <w:bottom w:val="single" w:sz="4" w:space="0" w:color="CCCCCC"/>
+              <w:right w:val="single" w:sz="4" w:space="0" w:color="CCCCCC"/>
+            </w:tcBorders>
+          </w:tcPr>
+          <w:p>
+            <w:pPr>
+              <w:spacing w:before="40" w:after="40"/>
+            </w:pPr>
+            <w:r>
+              <w:rPr>
+                <w:rFonts w:ascii="Consolas" w:hAnsi="Consolas"/>
+                <w:color w:val="000000"/>
+                <w:sz w:val="18"/>
+              </w:rPr>
+              <w:t>python main.py rag -q "How do I fix authentication token expired error?"</w:t>
+            </w:r>
+          </w:p>
+        </w:tc>
+      </w:tr>
+    </w:tbl>
+    <w:p>
+      <w:pPr>
+        <w:spacing w:after="40"/>
+      </w:pPr>
+    </w:p>
+    <w:p>
+      <w:pPr>
+        <w:keepNext/>
+        <w:spacing w:before="200" w:after="60"/>
+      </w:pPr>
+      <w:r>
+        <w:rPr>
+          <w:rFonts w:ascii="Calibri" w:hAnsi="Calibri"/>
+          <w:b/>
+          <w:color w:val="000000"/>
+          <w:sz w:val="23"/>
+        </w:rPr>
+        <w:t>5.5 Running the Automated Test Suite</w:t>
+      </w:r>
+    </w:p>
+    <w:p>
+      <w:pPr>
+        <w:spacing w:before="0" w:after="80" w:line="276" w:lineRule="auto"/>
+      </w:pPr>
+      <w:r>
+        <w:rPr>
+          <w:rFonts w:ascii="Calibri" w:hAnsi="Calibri"/>
+          <w:color w:val="000000"/>
+          <w:sz w:val="21"/>
+        </w:rPr>
+        <w:t>Run all unit and integration tests across the OCR, RAG, and Server subsystems:</w:t>
+      </w:r>
+    </w:p>
+    <w:tbl>
+      <w:tblPr>
+        <w:tblW w:type="auto" w:w="0"/>
+        <w:jc w:val="center"/>
+        <w:tblLayout w:type="fixed"/>
+        <w:tblLook w:firstColumn="1" w:firstRow="1" w:lastColumn="0" w:lastRow="0" w:noHBand="0" w:noVBand="1" w:val="04A0"/>
+      </w:tblPr>
+      <w:tblGrid>
+        <w:gridCol w:w="9360"/>
+      </w:tblGrid>
+      <w:tr>
+        <w:tc>
+          <w:tcPr>
+            <w:tcW w:type="dxa" w:w="10080"/>
+            <w:shd w:fill="F3F4F6"/>
+            <w:tcMar>
+              <w:top w:w="60" w:type="dxa"/>
+              <w:bottom w:w="60" w:type="dxa"/>
+              <w:left w:w="120" w:type="dxa"/>
+              <w:right w:w="120" w:type="dxa"/>
+            </w:tcMar>
+            <w:tcBorders>
+              <w:top w:val="single" w:sz="4" w:space="0" w:color="CCCCCC"/>
+              <w:left w:val="single" w:sz="4" w:space="0" w:color="CCCCCC"/>
+              <w:bottom w:val="single" w:sz="4" w:space="0" w:color="CCCCCC"/>
+              <w:right w:val="single" w:sz="4" w:space="0" w:color="CCCCCC"/>
+            </w:tcBorders>
+          </w:tcPr>
+          <w:p>
+            <w:pPr>
+              <w:spacing w:before="40" w:after="40"/>
+            </w:pPr>
+            <w:r>
+              <w:rPr>
+                <w:rFonts w:ascii="Consolas" w:hAnsi="Consolas"/>
+                <w:color w:val="000000"/>
+                <w:sz w:val="18"/>
+              </w:rPr>
+              <w:t>pytest</w:t>
+            </w:r>
+          </w:p>
+        </w:tc>
+      </w:tr>
+    </w:tbl>
+    <w:p>
+      <w:pPr>
+        <w:spacing w:after="40"/>
+      </w:pPr>
+    </w:p>
+    <w:p>
+      <w:pPr>
+        <w:spacing w:before="0" w:after="80" w:line="276" w:lineRule="auto"/>
+      </w:pPr>
+      <w:r>
+        <w:rPr>
+          <w:rFonts w:ascii="Calibri" w:hAnsi="Calibri"/>
+          <w:color w:val="000000"/>
+          <w:sz w:val="21"/>
+        </w:rPr>
+        <w:t>Run the end-to-end knowledge base pipeline test verifying all 12 support scenarios:</w:t>
+      </w:r>
+    </w:p>
+    <w:tbl>
+      <w:tblPr>
+        <w:tblW w:type="auto" w:w="0"/>
+        <w:jc w:val="center"/>
+        <w:tblLayout w:type="fixed"/>
+        <w:tblLook w:firstColumn="1" w:firstRow="1" w:lastColumn="0" w:lastRow="0" w:noHBand="0" w:noVBand="1" w:val="04A0"/>
+      </w:tblPr>
+      <w:tblGrid>
+        <w:gridCol w:w="9360"/>
+      </w:tblGrid>
+      <w:tr>
+        <w:tc>
+          <w:tcPr>
+            <w:tcW w:type="dxa" w:w="10080"/>
+            <w:shd w:fill="F3F4F6"/>
+            <w:tcMar>
+              <w:top w:w="60" w:type="dxa"/>
+              <w:bottom w:w="60" w:type="dxa"/>
+              <w:left w:w="120" w:type="dxa"/>
+              <w:right w:w="120" w:type="dxa"/>
+            </w:tcMar>
+            <w:tcBorders>
+              <w:top w:val="single" w:sz="4" w:space="0" w:color="CCCCCC"/>
+              <w:left w:val="single" w:sz="4" w:space="0" w:color="CCCCCC"/>
+              <w:bottom w:val="single" w:sz="4" w:space="0" w:color="CCCCCC"/>
+              <w:right w:val="single" w:sz="4" w:space="0" w:color="CCCCCC"/>
+            </w:tcBorders>
+          </w:tcPr>
+          <w:p>
+            <w:pPr>
+              <w:spacing w:before="40" w:after="40"/>
+            </w:pPr>
+            <w:r>
+              <w:rPr>
+                <w:rFonts w:ascii="Consolas" w:hAnsi="Consolas"/>
+                <w:color w:val="000000"/>
+                <w:sz w:val="18"/>
+              </w:rPr>
+              <w:t>python RAG/test_rag_pipeline.py</w:t>
+            </w:r>
+          </w:p>
+        </w:tc>
+      </w:tr>
+    </w:tbl>
+    <w:p>
+      <w:pPr>
+        <w:spacing w:after="40"/>
+      </w:pPr>
+    </w:p>
+    <w:p>
+      <w:pPr>
+        <w:keepNext/>
+        <w:spacing w:before="280" w:after="80"/>
+      </w:pPr>
+      <w:r>
+        <w:rPr>
+          <w:rFonts w:ascii="Calibri" w:hAnsi="Calibri"/>
+          <w:b/>
+          <w:color w:val="000000"/>
+          <w:sz w:val="26"/>
+        </w:rPr>
+        <w:t>6. Verification &amp; Robustness Results</w:t>
       </w:r>
     </w:p>
     <w:p>
@@ -1718,7 +2554,7 @@
           <w:color w:val="000000"/>
           <w:sz w:val="20"/>
         </w:rPr>
-        <w:t>24 automated unit and integration tests verify the image codec, spatial reading order, regex entity extractor, privacy scrubber, vector ingestion, and FastAPI endpoints.</w:t>
+        <w:t>24 automated unit and integration tests verify the image codec, spatial reading order, regex entity extractor, privacy scrubber, vector ingestion, and FastAPI endpoints with zero failures.</w:t>
       </w:r>
     </w:p>
     <w:sectPr>

</xml_diff>

<commit_message>
style: change tables to basic original Table Grid style
</commit_message>
<xml_diff>
--- a/AI/ChatbotOCR/SOLUTION_BRIEF.docx
+++ b/AI/ChatbotOCR/SOLUTION_BRIEF.docx
@@ -32,18 +32,11 @@
     </w:p>
     <w:tbl>
       <w:tblPr>
+        <w:tblStyle w:val="TableGrid"/>
         <w:tblW w:type="auto" w:w="0"/>
         <w:jc w:val="center"/>
         <w:tblLayout w:type="fixed"/>
         <w:tblLook w:firstColumn="1" w:firstRow="1" w:lastColumn="0" w:lastRow="0" w:noHBand="0" w:noVBand="1" w:val="04A0"/>
-        <w:tblBorders>
-          <w:top w:val="single" w:sz="4" w:space="0" w:color="E5E7EB"/>
-          <w:bottom w:val="single" w:sz="4" w:space="0" w:color="E5E7EB"/>
-          <w:left w:val="none"/>
-          <w:right w:val="none"/>
-          <w:insideH w:val="single" w:sz="4" w:space="0" w:color="E5E7EB"/>
-          <w:insideV w:val="none"/>
-        </w:tblBorders>
       </w:tblPr>
       <w:tblGrid>
         <w:gridCol w:w="2520"/>
@@ -55,7 +48,6 @@
         <w:tc>
           <w:tcPr>
             <w:tcW w:type="dxa" w:w="1728"/>
-            <w:shd w:fill="F3F4F6"/>
             <w:tcMar>
               <w:top w:w="50" w:type="dxa"/>
               <w:bottom w:w="50" w:type="dxa"/>
@@ -81,7 +73,6 @@
         <w:tc>
           <w:tcPr>
             <w:tcW w:type="dxa" w:w="3024"/>
-            <w:shd w:fill="FFFFFF"/>
             <w:tcMar>
               <w:top w:w="50" w:type="dxa"/>
               <w:bottom w:w="50" w:type="dxa"/>
@@ -106,7 +97,6 @@
         <w:tc>
           <w:tcPr>
             <w:tcW w:type="dxa" w:w="1728"/>
-            <w:shd w:fill="F3F4F6"/>
             <w:tcMar>
               <w:top w:w="50" w:type="dxa"/>
               <w:bottom w:w="50" w:type="dxa"/>
@@ -132,7 +122,6 @@
         <w:tc>
           <w:tcPr>
             <w:tcW w:type="dxa" w:w="2880"/>
-            <w:shd w:fill="FFFFFF"/>
             <w:tcMar>
               <w:top w:w="50" w:type="dxa"/>
               <w:bottom w:w="50" w:type="dxa"/>
@@ -159,7 +148,6 @@
         <w:tc>
           <w:tcPr>
             <w:tcW w:type="dxa" w:w="1728"/>
-            <w:shd w:fill="F3F4F6"/>
             <w:tcMar>
               <w:top w:w="50" w:type="dxa"/>
               <w:bottom w:w="50" w:type="dxa"/>
@@ -185,7 +173,6 @@
         <w:tc>
           <w:tcPr>
             <w:tcW w:type="dxa" w:w="3024"/>
-            <w:shd w:fill="FFFFFF"/>
             <w:tcMar>
               <w:top w:w="50" w:type="dxa"/>
               <w:bottom w:w="50" w:type="dxa"/>
@@ -210,7 +197,6 @@
         <w:tc>
           <w:tcPr>
             <w:tcW w:type="dxa" w:w="1728"/>
-            <w:shd w:fill="F3F4F6"/>
             <w:tcMar>
               <w:top w:w="50" w:type="dxa"/>
               <w:bottom w:w="50" w:type="dxa"/>
@@ -236,7 +222,6 @@
         <w:tc>
           <w:tcPr>
             <w:tcW w:type="dxa" w:w="2880"/>
-            <w:shd w:fill="FFFFFF"/>
             <w:tcMar>
               <w:top w:w="50" w:type="dxa"/>
               <w:bottom w:w="50" w:type="dxa"/>
@@ -306,64 +291,28 @@
         <w:t>This project builds an automated support chatbot that performs this entire troubleshooting workflow from end to end. The system accepts a customer's screenshot, extracts the technical problem without using an LLM, finds matching troubleshooting procedures in a vector knowledge base (Milvus Lite), and generates a verified, step-by-step resolution for the user in a clean chat window.</w:t>
       </w:r>
     </w:p>
-    <w:tbl>
-      <w:tblPr>
-        <w:tblW w:type="auto" w:w="0"/>
-        <w:jc w:val="center"/>
-        <w:tblLayout w:type="fixed"/>
-        <w:tblLook w:firstColumn="1" w:firstRow="1" w:lastColumn="0" w:lastRow="0" w:noHBand="0" w:noVBand="1" w:val="04A0"/>
-      </w:tblPr>
-      <w:tblGrid>
-        <w:gridCol w:w="9360"/>
-      </w:tblGrid>
-      <w:tr>
-        <w:tc>
-          <w:tcPr>
-            <w:tcW w:type="dxa" w:w="10080"/>
-            <w:shd w:fill="F9FAFB"/>
-            <w:tcMar>
-              <w:top w:w="120" w:type="dxa"/>
-              <w:bottom w:w="120" w:type="dxa"/>
-              <w:left w:w="160" w:type="dxa"/>
-              <w:right w:w="160" w:type="dxa"/>
-            </w:tcMar>
-            <w:tcBorders>
-              <w:top w:val="single" w:sz="4" w:space="0" w:color="999999"/>
-              <w:left w:val="single" w:sz="18" w:space="0" w:color="000000"/>
-              <w:bottom w:val="single" w:sz="4" w:space="0" w:color="999999"/>
-              <w:right w:val="single" w:sz="4" w:space="0" w:color="999999"/>
-            </w:tcBorders>
-          </w:tcPr>
-          <w:p>
-            <w:pPr>
-              <w:spacing w:before="40" w:after="40" w:line="276" w:lineRule="auto"/>
-            </w:pPr>
-            <w:r>
-              <w:rPr>
-                <w:rFonts w:ascii="Calibri" w:hAnsi="Calibri"/>
-                <w:b/>
-                <w:color w:val="000000"/>
-                <w:sz w:val="21"/>
-              </w:rPr>
-              <w:t>Core Architectural Principle</w:t>
-              <w:br/>
-            </w:r>
-            <w:r>
-              <w:rPr>
-                <w:rFonts w:ascii="Calibri" w:hAnsi="Calibri"/>
-                <w:color w:val="000000"/>
-                <w:sz w:val="20"/>
-              </w:rPr>
-              <w:t>Core Rule: Visual information extraction is strictly non-LLM. The system extracts error codes and messages using local OCR and deterministic rules. This prevents hallucinations on exact codes, protects customer privacy by masking sensitive data locally, and keeps extraction latency under 300 milliseconds. The LLM is only used at the very end to write a helpful, grounded response.</w:t>
-            </w:r>
-          </w:p>
-        </w:tc>
-      </w:tr>
-    </w:tbl>
     <w:p>
       <w:pPr>
-        <w:spacing w:after="60"/>
+        <w:spacing w:before="80" w:after="120" w:line="276" w:lineRule="auto"/>
+        <w:ind w:left="360" w:right="360"/>
       </w:pPr>
+      <w:r>
+        <w:rPr>
+          <w:rFonts w:ascii="Calibri" w:hAnsi="Calibri"/>
+          <w:b/>
+          <w:color w:val="000000"/>
+          <w:sz w:val="20"/>
+        </w:rPr>
+        <w:t xml:space="preserve">Core Architectural Principle: </w:t>
+      </w:r>
+      <w:r>
+        <w:rPr>
+          <w:rFonts w:ascii="Calibri" w:hAnsi="Calibri"/>
+          <w:color w:val="000000"/>
+          <w:sz w:val="20"/>
+        </w:rPr>
+        <w:t>Visual information extraction is strictly non-LLM. The system extracts error codes and messages using local OCR and deterministic rules. This prevents hallucinations on exact codes, protects customer privacy by masking sensitive data locally, and keeps extraction latency under 300 milliseconds. The LLM is only used at the very end to write a helpful, grounded response.</w:t>
+      </w:r>
     </w:p>
     <w:p>
       <w:pPr>
@@ -755,18 +704,11 @@
     </w:p>
     <w:tbl>
       <w:tblPr>
+        <w:tblStyle w:val="TableGrid"/>
         <w:tblW w:type="auto" w:w="0"/>
         <w:jc w:val="center"/>
         <w:tblLayout w:type="fixed"/>
         <w:tblLook w:firstColumn="1" w:firstRow="1" w:lastColumn="0" w:lastRow="0" w:noHBand="0" w:noVBand="1" w:val="04A0"/>
-        <w:tblBorders>
-          <w:top w:val="single" w:sz="4" w:space="0" w:color="CCCCCC"/>
-          <w:bottom w:val="single" w:sz="4" w:space="0" w:color="CCCCCC"/>
-          <w:left w:val="none"/>
-          <w:right w:val="none"/>
-          <w:insideH w:val="single" w:sz="4" w:space="0" w:color="CCCCCC"/>
-          <w:insideV w:val="none"/>
-        </w:tblBorders>
       </w:tblPr>
       <w:tblGrid>
         <w:gridCol w:w="2520"/>
@@ -778,7 +720,6 @@
         <w:tc>
           <w:tcPr>
             <w:tcW w:type="dxa" w:w="1440"/>
-            <w:shd w:fill="E5E7EB"/>
             <w:tcMar>
               <w:top w:w="70" w:type="dxa"/>
               <w:bottom w:w="70" w:type="dxa"/>
@@ -795,7 +736,7 @@
                 <w:rFonts w:ascii="Calibri" w:hAnsi="Calibri"/>
                 <w:b/>
                 <w:color w:val="000000"/>
-                <w:sz w:val="18"/>
+                <w:sz w:val="19"/>
               </w:rPr>
               <w:t>Stage</w:t>
             </w:r>
@@ -804,7 +745,6 @@
         <w:tc>
           <w:tcPr>
             <w:tcW w:type="dxa" w:w="2016"/>
-            <w:shd w:fill="E5E7EB"/>
             <w:tcMar>
               <w:top w:w="70" w:type="dxa"/>
               <w:bottom w:w="70" w:type="dxa"/>
@@ -821,7 +761,7 @@
                 <w:rFonts w:ascii="Calibri" w:hAnsi="Calibri"/>
                 <w:b/>
                 <w:color w:val="000000"/>
-                <w:sz w:val="18"/>
+                <w:sz w:val="19"/>
               </w:rPr>
               <w:t>Input</w:t>
             </w:r>
@@ -830,7 +770,6 @@
         <w:tc>
           <w:tcPr>
             <w:tcW w:type="dxa" w:w="3888"/>
-            <w:shd w:fill="E5E7EB"/>
             <w:tcMar>
               <w:top w:w="70" w:type="dxa"/>
               <w:bottom w:w="70" w:type="dxa"/>
@@ -847,7 +786,7 @@
                 <w:rFonts w:ascii="Calibri" w:hAnsi="Calibri"/>
                 <w:b/>
                 <w:color w:val="000000"/>
-                <w:sz w:val="18"/>
+                <w:sz w:val="19"/>
               </w:rPr>
               <w:t>What It Does</w:t>
             </w:r>
@@ -856,7 +795,6 @@
         <w:tc>
           <w:tcPr>
             <w:tcW w:type="dxa" w:w="2016"/>
-            <w:shd w:fill="E5E7EB"/>
             <w:tcMar>
               <w:top w:w="70" w:type="dxa"/>
               <w:bottom w:w="70" w:type="dxa"/>
@@ -873,7 +811,7 @@
                 <w:rFonts w:ascii="Calibri" w:hAnsi="Calibri"/>
                 <w:b/>
                 <w:color w:val="000000"/>
-                <w:sz w:val="18"/>
+                <w:sz w:val="19"/>
               </w:rPr>
               <w:t>Output</w:t>
             </w:r>
@@ -884,7 +822,6 @@
         <w:tc>
           <w:tcPr>
             <w:tcW w:type="dxa" w:w="1440"/>
-            <w:shd w:fill="F9FAFB"/>
             <w:tcMar>
               <w:top w:w="50" w:type="dxa"/>
               <w:bottom w:w="50" w:type="dxa"/>
@@ -901,7 +838,7 @@
                 <w:rFonts w:ascii="Calibri" w:hAnsi="Calibri"/>
                 <w:b/>
                 <w:color w:val="000000"/>
-                <w:sz w:val="17"/>
+                <w:sz w:val="18"/>
               </w:rPr>
               <w:t>1. Ingest</w:t>
             </w:r>
@@ -910,7 +847,6 @@
         <w:tc>
           <w:tcPr>
             <w:tcW w:type="dxa" w:w="2016"/>
-            <w:shd w:fill="F9FAFB"/>
             <w:tcMar>
               <w:top w:w="50" w:type="dxa"/>
               <w:bottom w:w="50" w:type="dxa"/>
@@ -926,7 +862,7 @@
               <w:rPr>
                 <w:rFonts w:ascii="Calibri" w:hAnsi="Calibri"/>
                 <w:color w:val="000000"/>
-                <w:sz w:val="17"/>
+                <w:sz w:val="18"/>
               </w:rPr>
               <w:t>Image file (PNG/JPG)</w:t>
             </w:r>
@@ -935,7 +871,6 @@
         <w:tc>
           <w:tcPr>
             <w:tcW w:type="dxa" w:w="3888"/>
-            <w:shd w:fill="F9FAFB"/>
             <w:tcMar>
               <w:top w:w="50" w:type="dxa"/>
               <w:bottom w:w="50" w:type="dxa"/>
@@ -951,7 +886,7 @@
               <w:rPr>
                 <w:rFonts w:ascii="Calibri" w:hAnsi="Calibri"/>
                 <w:color w:val="000000"/>
-                <w:sz w:val="17"/>
+                <w:sz w:val="18"/>
               </w:rPr>
               <w:t>Validates file header, checks integrity, and decodes image into memory.</w:t>
             </w:r>
@@ -960,7 +895,6 @@
         <w:tc>
           <w:tcPr>
             <w:tcW w:type="dxa" w:w="2016"/>
-            <w:shd w:fill="F9FAFB"/>
             <w:tcMar>
               <w:top w:w="50" w:type="dxa"/>
               <w:bottom w:w="50" w:type="dxa"/>
@@ -976,7 +910,7 @@
               <w:rPr>
                 <w:rFonts w:ascii="Calibri" w:hAnsi="Calibri"/>
                 <w:color w:val="000000"/>
-                <w:sz w:val="17"/>
+                <w:sz w:val="18"/>
               </w:rPr>
               <w:t>Image array in memory</w:t>
             </w:r>
@@ -987,7 +921,6 @@
         <w:tc>
           <w:tcPr>
             <w:tcW w:type="dxa" w:w="1440"/>
-            <w:shd w:fill="FFFFFF"/>
             <w:tcMar>
               <w:top w:w="50" w:type="dxa"/>
               <w:bottom w:w="50" w:type="dxa"/>
@@ -1004,7 +937,7 @@
                 <w:rFonts w:ascii="Calibri" w:hAnsi="Calibri"/>
                 <w:b/>
                 <w:color w:val="000000"/>
-                <w:sz w:val="17"/>
+                <w:sz w:val="18"/>
               </w:rPr>
               <w:t>2. OCR</w:t>
             </w:r>
@@ -1013,7 +946,6 @@
         <w:tc>
           <w:tcPr>
             <w:tcW w:type="dxa" w:w="2016"/>
-            <w:shd w:fill="FFFFFF"/>
             <w:tcMar>
               <w:top w:w="50" w:type="dxa"/>
               <w:bottom w:w="50" w:type="dxa"/>
@@ -1029,7 +961,7 @@
               <w:rPr>
                 <w:rFonts w:ascii="Calibri" w:hAnsi="Calibri"/>
                 <w:color w:val="000000"/>
-                <w:sz w:val="17"/>
+                <w:sz w:val="18"/>
               </w:rPr>
               <w:t>Image array</w:t>
             </w:r>
@@ -1038,7 +970,6 @@
         <w:tc>
           <w:tcPr>
             <w:tcW w:type="dxa" w:w="3888"/>
-            <w:shd w:fill="FFFFFF"/>
             <w:tcMar>
               <w:top w:w="50" w:type="dxa"/>
               <w:bottom w:w="50" w:type="dxa"/>
@@ -1054,7 +985,7 @@
               <w:rPr>
                 <w:rFonts w:ascii="Calibri" w:hAnsi="Calibri"/>
                 <w:color w:val="000000"/>
-                <w:sz w:val="17"/>
+                <w:sz w:val="18"/>
               </w:rPr>
               <w:t>Applies contrast preprocessing and extracts text lines in visual reading order.</w:t>
             </w:r>
@@ -1063,7 +994,6 @@
         <w:tc>
           <w:tcPr>
             <w:tcW w:type="dxa" w:w="2016"/>
-            <w:shd w:fill="FFFFFF"/>
             <w:tcMar>
               <w:top w:w="50" w:type="dxa"/>
               <w:bottom w:w="50" w:type="dxa"/>
@@ -1079,7 +1009,7 @@
               <w:rPr>
                 <w:rFonts w:ascii="Calibri" w:hAnsi="Calibri"/>
                 <w:color w:val="000000"/>
-                <w:sz w:val="17"/>
+                <w:sz w:val="18"/>
               </w:rPr>
               <w:t>Ordered text lines</w:t>
             </w:r>
@@ -1090,7 +1020,6 @@
         <w:tc>
           <w:tcPr>
             <w:tcW w:type="dxa" w:w="1440"/>
-            <w:shd w:fill="F9FAFB"/>
             <w:tcMar>
               <w:top w:w="50" w:type="dxa"/>
               <w:bottom w:w="50" w:type="dxa"/>
@@ -1107,7 +1036,7 @@
                 <w:rFonts w:ascii="Calibri" w:hAnsi="Calibri"/>
                 <w:b/>
                 <w:color w:val="000000"/>
-                <w:sz w:val="17"/>
+                <w:sz w:val="18"/>
               </w:rPr>
               <w:t>3. Parse</w:t>
             </w:r>
@@ -1116,7 +1045,6 @@
         <w:tc>
           <w:tcPr>
             <w:tcW w:type="dxa" w:w="2016"/>
-            <w:shd w:fill="F9FAFB"/>
             <w:tcMar>
               <w:top w:w="50" w:type="dxa"/>
               <w:bottom w:w="50" w:type="dxa"/>
@@ -1132,7 +1060,7 @@
               <w:rPr>
                 <w:rFonts w:ascii="Calibri" w:hAnsi="Calibri"/>
                 <w:color w:val="000000"/>
-                <w:sz w:val="17"/>
+                <w:sz w:val="18"/>
               </w:rPr>
               <w:t>Ordered text lines</w:t>
             </w:r>
@@ -1141,7 +1069,6 @@
         <w:tc>
           <w:tcPr>
             <w:tcW w:type="dxa" w:w="3888"/>
-            <w:shd w:fill="F9FAFB"/>
             <w:tcMar>
               <w:top w:w="50" w:type="dxa"/>
               <w:bottom w:w="50" w:type="dxa"/>
@@ -1157,7 +1084,7 @@
               <w:rPr>
                 <w:rFonts w:ascii="Calibri" w:hAnsi="Calibri"/>
                 <w:color w:val="000000"/>
-                <w:sz w:val="17"/>
+                <w:sz w:val="18"/>
               </w:rPr>
               <w:t>Extracts error codes and messages via regex; masks emails, tokens, and keys.</w:t>
             </w:r>
@@ -1166,7 +1093,6 @@
         <w:tc>
           <w:tcPr>
             <w:tcW w:type="dxa" w:w="2016"/>
-            <w:shd w:fill="F9FAFB"/>
             <w:tcMar>
               <w:top w:w="50" w:type="dxa"/>
               <w:bottom w:w="50" w:type="dxa"/>
@@ -1182,7 +1108,7 @@
               <w:rPr>
                 <w:rFonts w:ascii="Calibri" w:hAnsi="Calibri"/>
                 <w:color w:val="000000"/>
-                <w:sz w:val="17"/>
+                <w:sz w:val="18"/>
               </w:rPr>
               <w:t>Sanitized diagnostic context</w:t>
             </w:r>
@@ -1193,7 +1119,6 @@
         <w:tc>
           <w:tcPr>
             <w:tcW w:type="dxa" w:w="1440"/>
-            <w:shd w:fill="FFFFFF"/>
             <w:tcMar>
               <w:top w:w="50" w:type="dxa"/>
               <w:bottom w:w="50" w:type="dxa"/>
@@ -1210,7 +1135,7 @@
                 <w:rFonts w:ascii="Calibri" w:hAnsi="Calibri"/>
                 <w:b/>
                 <w:color w:val="000000"/>
-                <w:sz w:val="17"/>
+                <w:sz w:val="18"/>
               </w:rPr>
               <w:t>4. Search</w:t>
             </w:r>
@@ -1219,7 +1144,6 @@
         <w:tc>
           <w:tcPr>
             <w:tcW w:type="dxa" w:w="2016"/>
-            <w:shd w:fill="FFFFFF"/>
             <w:tcMar>
               <w:top w:w="50" w:type="dxa"/>
               <w:bottom w:w="50" w:type="dxa"/>
@@ -1235,7 +1159,7 @@
               <w:rPr>
                 <w:rFonts w:ascii="Calibri" w:hAnsi="Calibri"/>
                 <w:color w:val="000000"/>
-                <w:sz w:val="17"/>
+                <w:sz w:val="18"/>
               </w:rPr>
               <w:t>Sanitized context</w:t>
             </w:r>
@@ -1244,7 +1168,6 @@
         <w:tc>
           <w:tcPr>
             <w:tcW w:type="dxa" w:w="3888"/>
-            <w:shd w:fill="FFFFFF"/>
             <w:tcMar>
               <w:top w:w="50" w:type="dxa"/>
               <w:bottom w:w="50" w:type="dxa"/>
@@ -1260,7 +1183,7 @@
               <w:rPr>
                 <w:rFonts w:ascii="Calibri" w:hAnsi="Calibri"/>
                 <w:color w:val="000000"/>
-                <w:sz w:val="17"/>
+                <w:sz w:val="18"/>
               </w:rPr>
               <w:t>Embeds text into a 384-d vector and searches Milvus Lite with code match bonus.</w:t>
             </w:r>
@@ -1269,7 +1192,6 @@
         <w:tc>
           <w:tcPr>
             <w:tcW w:type="dxa" w:w="2016"/>
-            <w:shd w:fill="FFFFFF"/>
             <w:tcMar>
               <w:top w:w="50" w:type="dxa"/>
               <w:bottom w:w="50" w:type="dxa"/>
@@ -1285,7 +1207,7 @@
               <w:rPr>
                 <w:rFonts w:ascii="Calibri" w:hAnsi="Calibri"/>
                 <w:color w:val="000000"/>
-                <w:sz w:val="17"/>
+                <w:sz w:val="18"/>
               </w:rPr>
               <w:t>Top-ranked KB articles</w:t>
             </w:r>
@@ -1296,7 +1218,6 @@
         <w:tc>
           <w:tcPr>
             <w:tcW w:type="dxa" w:w="1440"/>
-            <w:shd w:fill="F9FAFB"/>
             <w:tcMar>
               <w:top w:w="50" w:type="dxa"/>
               <w:bottom w:w="50" w:type="dxa"/>
@@ -1313,7 +1234,7 @@
                 <w:rFonts w:ascii="Calibri" w:hAnsi="Calibri"/>
                 <w:b/>
                 <w:color w:val="000000"/>
-                <w:sz w:val="17"/>
+                <w:sz w:val="18"/>
               </w:rPr>
               <w:t>5. Guard</w:t>
             </w:r>
@@ -1322,7 +1243,6 @@
         <w:tc>
           <w:tcPr>
             <w:tcW w:type="dxa" w:w="2016"/>
-            <w:shd w:fill="F9FAFB"/>
             <w:tcMar>
               <w:top w:w="50" w:type="dxa"/>
               <w:bottom w:w="50" w:type="dxa"/>
@@ -1338,7 +1258,7 @@
               <w:rPr>
                 <w:rFonts w:ascii="Calibri" w:hAnsi="Calibri"/>
                 <w:color w:val="000000"/>
-                <w:sz w:val="17"/>
+                <w:sz w:val="18"/>
               </w:rPr>
               <w:t>Ranked articles</w:t>
             </w:r>
@@ -1347,7 +1267,6 @@
         <w:tc>
           <w:tcPr>
             <w:tcW w:type="dxa" w:w="3888"/>
-            <w:shd w:fill="F9FAFB"/>
             <w:tcMar>
               <w:top w:w="50" w:type="dxa"/>
               <w:bottom w:w="50" w:type="dxa"/>
@@ -1363,7 +1282,7 @@
               <w:rPr>
                 <w:rFonts w:ascii="Calibri" w:hAnsi="Calibri"/>
                 <w:color w:val="000000"/>
-                <w:sz w:val="17"/>
+                <w:sz w:val="18"/>
               </w:rPr>
               <w:t>Checks if top confidence score &gt;= 0.45; triggers safe fallback if low.</w:t>
             </w:r>
@@ -1372,7 +1291,6 @@
         <w:tc>
           <w:tcPr>
             <w:tcW w:type="dxa" w:w="2016"/>
-            <w:shd w:fill="F9FAFB"/>
             <w:tcMar>
               <w:top w:w="50" w:type="dxa"/>
               <w:bottom w:w="50" w:type="dxa"/>
@@ -1388,7 +1306,7 @@
               <w:rPr>
                 <w:rFonts w:ascii="Calibri" w:hAnsi="Calibri"/>
                 <w:color w:val="000000"/>
-                <w:sz w:val="17"/>
+                <w:sz w:val="18"/>
               </w:rPr>
               <w:t>Execution decision</w:t>
             </w:r>
@@ -1399,7 +1317,6 @@
         <w:tc>
           <w:tcPr>
             <w:tcW w:type="dxa" w:w="1440"/>
-            <w:shd w:fill="FFFFFF"/>
             <w:tcMar>
               <w:top w:w="50" w:type="dxa"/>
               <w:bottom w:w="50" w:type="dxa"/>
@@ -1416,7 +1333,7 @@
                 <w:rFonts w:ascii="Calibri" w:hAnsi="Calibri"/>
                 <w:b/>
                 <w:color w:val="000000"/>
-                <w:sz w:val="17"/>
+                <w:sz w:val="18"/>
               </w:rPr>
               <w:t>6. Solve</w:t>
             </w:r>
@@ -1425,7 +1342,6 @@
         <w:tc>
           <w:tcPr>
             <w:tcW w:type="dxa" w:w="2016"/>
-            <w:shd w:fill="FFFFFF"/>
             <w:tcMar>
               <w:top w:w="50" w:type="dxa"/>
               <w:bottom w:w="50" w:type="dxa"/>
@@ -1441,7 +1357,7 @@
               <w:rPr>
                 <w:rFonts w:ascii="Calibri" w:hAnsi="Calibri"/>
                 <w:color w:val="000000"/>
-                <w:sz w:val="17"/>
+                <w:sz w:val="18"/>
               </w:rPr>
               <w:t>Context + Query</w:t>
             </w:r>
@@ -1450,7 +1366,6 @@
         <w:tc>
           <w:tcPr>
             <w:tcW w:type="dxa" w:w="3888"/>
-            <w:shd w:fill="FFFFFF"/>
             <w:tcMar>
               <w:top w:w="50" w:type="dxa"/>
               <w:bottom w:w="50" w:type="dxa"/>
@@ -1466,7 +1381,7 @@
               <w:rPr>
                 <w:rFonts w:ascii="Calibri" w:hAnsi="Calibri"/>
                 <w:color w:val="000000"/>
-                <w:sz w:val="17"/>
+                <w:sz w:val="18"/>
               </w:rPr>
               <w:t>Drafts grounded 5-part troubleshooting instructions citing source documents.</w:t>
             </w:r>
@@ -1475,7 +1390,6 @@
         <w:tc>
           <w:tcPr>
             <w:tcW w:type="dxa" w:w="2016"/>
-            <w:shd w:fill="FFFFFF"/>
             <w:tcMar>
               <w:top w:w="50" w:type="dxa"/>
               <w:bottom w:w="50" w:type="dxa"/>
@@ -1491,7 +1405,7 @@
               <w:rPr>
                 <w:rFonts w:ascii="Calibri" w:hAnsi="Calibri"/>
                 <w:color w:val="000000"/>
-                <w:sz w:val="17"/>
+                <w:sz w:val="18"/>
               </w:rPr>
               <w:t>Customer-ready solution</w:t>
             </w:r>
@@ -1680,56 +1594,21 @@
         <w:t>1. Clone the repository and enter the project directory:</w:t>
       </w:r>
     </w:p>
-    <w:tbl>
-      <w:tblPr>
-        <w:tblW w:type="auto" w:w="0"/>
-        <w:jc w:val="center"/>
-        <w:tblLayout w:type="fixed"/>
-        <w:tblLook w:firstColumn="1" w:firstRow="1" w:lastColumn="0" w:lastRow="0" w:noHBand="0" w:noVBand="1" w:val="04A0"/>
-      </w:tblPr>
-      <w:tblGrid>
-        <w:gridCol w:w="9360"/>
-      </w:tblGrid>
-      <w:tr>
-        <w:tc>
-          <w:tcPr>
-            <w:tcW w:type="dxa" w:w="10080"/>
-            <w:shd w:fill="F3F4F6"/>
-            <w:tcMar>
-              <w:top w:w="60" w:type="dxa"/>
-              <w:bottom w:w="60" w:type="dxa"/>
-              <w:left w:w="120" w:type="dxa"/>
-              <w:right w:w="120" w:type="dxa"/>
-            </w:tcMar>
-            <w:tcBorders>
-              <w:top w:val="single" w:sz="4" w:space="0" w:color="CCCCCC"/>
-              <w:left w:val="single" w:sz="4" w:space="0" w:color="CCCCCC"/>
-              <w:bottom w:val="single" w:sz="4" w:space="0" w:color="CCCCCC"/>
-              <w:right w:val="single" w:sz="4" w:space="0" w:color="CCCCCC"/>
-            </w:tcBorders>
-          </w:tcPr>
-          <w:p>
-            <w:pPr>
-              <w:spacing w:before="40" w:after="40"/>
-            </w:pPr>
-            <w:r>
-              <w:rPr>
-                <w:rFonts w:ascii="Consolas" w:hAnsi="Consolas"/>
-                <w:color w:val="000000"/>
-                <w:sz w:val="18"/>
-              </w:rPr>
-              <w:t>git clone https://github.com/NVKQ2022/MVP.git</w:t>
-              <w:br/>
-              <w:t>cd MVP/AI/ChatbotOCR</w:t>
-            </w:r>
-          </w:p>
-        </w:tc>
-      </w:tr>
-    </w:tbl>
     <w:p>
       <w:pPr>
-        <w:spacing w:after="40"/>
+        <w:spacing w:before="40" w:after="80"/>
+        <w:ind w:left="360"/>
       </w:pPr>
+      <w:r>
+        <w:rPr>
+          <w:rFonts w:ascii="Consolas" w:hAnsi="Consolas"/>
+          <w:color w:val="000000"/>
+          <w:sz w:val="19"/>
+        </w:rPr>
+        <w:t>git clone https://github.com/NVKQ2022/MVP.git</w:t>
+        <w:br/>
+        <w:t>cd MVP/AI/ChatbotOCR</w:t>
+      </w:r>
     </w:p>
     <w:p>
       <w:pPr>
@@ -1744,56 +1623,21 @@
         <w:t>2. Create and activate a Python virtual environment (Python 3.10+ or 3.12):</w:t>
       </w:r>
     </w:p>
-    <w:tbl>
-      <w:tblPr>
-        <w:tblW w:type="auto" w:w="0"/>
-        <w:jc w:val="center"/>
-        <w:tblLayout w:type="fixed"/>
-        <w:tblLook w:firstColumn="1" w:firstRow="1" w:lastColumn="0" w:lastRow="0" w:noHBand="0" w:noVBand="1" w:val="04A0"/>
-      </w:tblPr>
-      <w:tblGrid>
-        <w:gridCol w:w="9360"/>
-      </w:tblGrid>
-      <w:tr>
-        <w:tc>
-          <w:tcPr>
-            <w:tcW w:type="dxa" w:w="10080"/>
-            <w:shd w:fill="F3F4F6"/>
-            <w:tcMar>
-              <w:top w:w="60" w:type="dxa"/>
-              <w:bottom w:w="60" w:type="dxa"/>
-              <w:left w:w="120" w:type="dxa"/>
-              <w:right w:w="120" w:type="dxa"/>
-            </w:tcMar>
-            <w:tcBorders>
-              <w:top w:val="single" w:sz="4" w:space="0" w:color="CCCCCC"/>
-              <w:left w:val="single" w:sz="4" w:space="0" w:color="CCCCCC"/>
-              <w:bottom w:val="single" w:sz="4" w:space="0" w:color="CCCCCC"/>
-              <w:right w:val="single" w:sz="4" w:space="0" w:color="CCCCCC"/>
-            </w:tcBorders>
-          </w:tcPr>
-          <w:p>
-            <w:pPr>
-              <w:spacing w:before="40" w:after="40"/>
-            </w:pPr>
-            <w:r>
-              <w:rPr>
-                <w:rFonts w:ascii="Consolas" w:hAnsi="Consolas"/>
-                <w:color w:val="000000"/>
-                <w:sz w:val="18"/>
-              </w:rPr>
-              <w:t>python3 -m venv venv</w:t>
-              <w:br/>
-              <w:t>source venv/bin/activate    # On Windows: venv\Scripts\activate</w:t>
-            </w:r>
-          </w:p>
-        </w:tc>
-      </w:tr>
-    </w:tbl>
     <w:p>
       <w:pPr>
-        <w:spacing w:after="40"/>
+        <w:spacing w:before="40" w:after="80"/>
+        <w:ind w:left="360"/>
       </w:pPr>
+      <w:r>
+        <w:rPr>
+          <w:rFonts w:ascii="Consolas" w:hAnsi="Consolas"/>
+          <w:color w:val="000000"/>
+          <w:sz w:val="19"/>
+        </w:rPr>
+        <w:t>python3 -m venv venv</w:t>
+        <w:br/>
+        <w:t>source venv/bin/activate    # On Windows: venv\Scripts\activate</w:t>
+      </w:r>
     </w:p>
     <w:p>
       <w:pPr>
@@ -1808,54 +1652,19 @@
         <w:t>3. Install the project dependencies:</w:t>
       </w:r>
     </w:p>
-    <w:tbl>
-      <w:tblPr>
-        <w:tblW w:type="auto" w:w="0"/>
-        <w:jc w:val="center"/>
-        <w:tblLayout w:type="fixed"/>
-        <w:tblLook w:firstColumn="1" w:firstRow="1" w:lastColumn="0" w:lastRow="0" w:noHBand="0" w:noVBand="1" w:val="04A0"/>
-      </w:tblPr>
-      <w:tblGrid>
-        <w:gridCol w:w="9360"/>
-      </w:tblGrid>
-      <w:tr>
-        <w:tc>
-          <w:tcPr>
-            <w:tcW w:type="dxa" w:w="10080"/>
-            <w:shd w:fill="F3F4F6"/>
-            <w:tcMar>
-              <w:top w:w="60" w:type="dxa"/>
-              <w:bottom w:w="60" w:type="dxa"/>
-              <w:left w:w="120" w:type="dxa"/>
-              <w:right w:w="120" w:type="dxa"/>
-            </w:tcMar>
-            <w:tcBorders>
-              <w:top w:val="single" w:sz="4" w:space="0" w:color="CCCCCC"/>
-              <w:left w:val="single" w:sz="4" w:space="0" w:color="CCCCCC"/>
-              <w:bottom w:val="single" w:sz="4" w:space="0" w:color="CCCCCC"/>
-              <w:right w:val="single" w:sz="4" w:space="0" w:color="CCCCCC"/>
-            </w:tcBorders>
-          </w:tcPr>
-          <w:p>
-            <w:pPr>
-              <w:spacing w:before="40" w:after="40"/>
-            </w:pPr>
-            <w:r>
-              <w:rPr>
-                <w:rFonts w:ascii="Consolas" w:hAnsi="Consolas"/>
-                <w:color w:val="000000"/>
-                <w:sz w:val="18"/>
-              </w:rPr>
-              <w:t>pip install -r requirements.txt</w:t>
-            </w:r>
-          </w:p>
-        </w:tc>
-      </w:tr>
-    </w:tbl>
     <w:p>
       <w:pPr>
-        <w:spacing w:after="40"/>
+        <w:spacing w:before="40" w:after="80"/>
+        <w:ind w:left="360"/>
       </w:pPr>
+      <w:r>
+        <w:rPr>
+          <w:rFonts w:ascii="Consolas" w:hAnsi="Consolas"/>
+          <w:color w:val="000000"/>
+          <w:sz w:val="19"/>
+        </w:rPr>
+        <w:t>pip install -r requirements.txt</w:t>
+      </w:r>
     </w:p>
     <w:p>
       <w:pPr>
@@ -1883,56 +1692,21 @@
         <w:t>Copy .env.example to .env and provide your Azure OpenAI credentials (API key, endpoint, model deployment name):</w:t>
       </w:r>
     </w:p>
-    <w:tbl>
-      <w:tblPr>
-        <w:tblW w:type="auto" w:w="0"/>
-        <w:jc w:val="center"/>
-        <w:tblLayout w:type="fixed"/>
-        <w:tblLook w:firstColumn="1" w:firstRow="1" w:lastColumn="0" w:lastRow="0" w:noHBand="0" w:noVBand="1" w:val="04A0"/>
-      </w:tblPr>
-      <w:tblGrid>
-        <w:gridCol w:w="9360"/>
-      </w:tblGrid>
-      <w:tr>
-        <w:tc>
-          <w:tcPr>
-            <w:tcW w:type="dxa" w:w="10080"/>
-            <w:shd w:fill="F3F4F6"/>
-            <w:tcMar>
-              <w:top w:w="60" w:type="dxa"/>
-              <w:bottom w:w="60" w:type="dxa"/>
-              <w:left w:w="120" w:type="dxa"/>
-              <w:right w:w="120" w:type="dxa"/>
-            </w:tcMar>
-            <w:tcBorders>
-              <w:top w:val="single" w:sz="4" w:space="0" w:color="CCCCCC"/>
-              <w:left w:val="single" w:sz="4" w:space="0" w:color="CCCCCC"/>
-              <w:bottom w:val="single" w:sz="4" w:space="0" w:color="CCCCCC"/>
-              <w:right w:val="single" w:sz="4" w:space="0" w:color="CCCCCC"/>
-            </w:tcBorders>
-          </w:tcPr>
-          <w:p>
-            <w:pPr>
-              <w:spacing w:before="40" w:after="40"/>
-            </w:pPr>
-            <w:r>
-              <w:rPr>
-                <w:rFonts w:ascii="Consolas" w:hAnsi="Consolas"/>
-                <w:color w:val="000000"/>
-                <w:sz w:val="18"/>
-              </w:rPr>
-              <w:t>cp .env.example .env</w:t>
-              <w:br/>
-              <w:t># Edit .env with your AZURE_OPENAI_API_KEY and AZURE_OPENAI_ENDPOINT</w:t>
-            </w:r>
-          </w:p>
-        </w:tc>
-      </w:tr>
-    </w:tbl>
     <w:p>
       <w:pPr>
-        <w:spacing w:after="40"/>
+        <w:spacing w:before="40" w:after="80"/>
+        <w:ind w:left="360"/>
       </w:pPr>
+      <w:r>
+        <w:rPr>
+          <w:rFonts w:ascii="Consolas" w:hAnsi="Consolas"/>
+          <w:color w:val="000000"/>
+          <w:sz w:val="19"/>
+        </w:rPr>
+        <w:t>cp .env.example .env</w:t>
+        <w:br/>
+        <w:t># Edit .env with your AZURE_OPENAI_API_KEY and AZURE_OPENAI_ENDPOINT</w:t>
+      </w:r>
     </w:p>
     <w:p>
       <w:pPr>
@@ -1962,56 +1736,21 @@
         <w:t>Launch the application using the root runner:</w:t>
       </w:r>
     </w:p>
-    <w:tbl>
-      <w:tblPr>
-        <w:tblW w:type="auto" w:w="0"/>
-        <w:jc w:val="center"/>
-        <w:tblLayout w:type="fixed"/>
-        <w:tblLook w:firstColumn="1" w:firstRow="1" w:lastColumn="0" w:lastRow="0" w:noHBand="0" w:noVBand="1" w:val="04A0"/>
-      </w:tblPr>
-      <w:tblGrid>
-        <w:gridCol w:w="9360"/>
-      </w:tblGrid>
-      <w:tr>
-        <w:tc>
-          <w:tcPr>
-            <w:tcW w:type="dxa" w:w="10080"/>
-            <w:shd w:fill="F3F4F6"/>
-            <w:tcMar>
-              <w:top w:w="60" w:type="dxa"/>
-              <w:bottom w:w="60" w:type="dxa"/>
-              <w:left w:w="120" w:type="dxa"/>
-              <w:right w:w="120" w:type="dxa"/>
-            </w:tcMar>
-            <w:tcBorders>
-              <w:top w:val="single" w:sz="4" w:space="0" w:color="CCCCCC"/>
-              <w:left w:val="single" w:sz="4" w:space="0" w:color="CCCCCC"/>
-              <w:bottom w:val="single" w:sz="4" w:space="0" w:color="CCCCCC"/>
-              <w:right w:val="single" w:sz="4" w:space="0" w:color="CCCCCC"/>
-            </w:tcBorders>
-          </w:tcPr>
-          <w:p>
-            <w:pPr>
-              <w:spacing w:before="40" w:after="40"/>
-            </w:pPr>
-            <w:r>
-              <w:rPr>
-                <w:rFonts w:ascii="Consolas" w:hAnsi="Consolas"/>
-                <w:color w:val="000000"/>
-                <w:sz w:val="18"/>
-              </w:rPr>
-              <w:t>python main.py</w:t>
-              <w:br/>
-              <w:t># Or explicitly: python main.py server --host 0.0.0.0 --port 8000</w:t>
-            </w:r>
-          </w:p>
-        </w:tc>
-      </w:tr>
-    </w:tbl>
     <w:p>
       <w:pPr>
-        <w:spacing w:after="40"/>
+        <w:spacing w:before="40" w:after="80"/>
+        <w:ind w:left="360"/>
       </w:pPr>
+      <w:r>
+        <w:rPr>
+          <w:rFonts w:ascii="Consolas" w:hAnsi="Consolas"/>
+          <w:color w:val="000000"/>
+          <w:sz w:val="19"/>
+        </w:rPr>
+        <w:t>python main.py</w:t>
+        <w:br/>
+        <w:t># Or explicitly: python main.py server --host 0.0.0.0 --port 8000</w:t>
+      </w:r>
     </w:p>
     <w:p>
       <w:pPr>
@@ -2100,54 +1839,19 @@
         <w:t>You can diagnose an error screenshot directly from the terminal without opening a browser:</w:t>
       </w:r>
     </w:p>
-    <w:tbl>
-      <w:tblPr>
-        <w:tblW w:type="auto" w:w="0"/>
-        <w:jc w:val="center"/>
-        <w:tblLayout w:type="fixed"/>
-        <w:tblLook w:firstColumn="1" w:firstRow="1" w:lastColumn="0" w:lastRow="0" w:noHBand="0" w:noVBand="1" w:val="04A0"/>
-      </w:tblPr>
-      <w:tblGrid>
-        <w:gridCol w:w="9360"/>
-      </w:tblGrid>
-      <w:tr>
-        <w:tc>
-          <w:tcPr>
-            <w:tcW w:type="dxa" w:w="10080"/>
-            <w:shd w:fill="F3F4F6"/>
-            <w:tcMar>
-              <w:top w:w="60" w:type="dxa"/>
-              <w:bottom w:w="60" w:type="dxa"/>
-              <w:left w:w="120" w:type="dxa"/>
-              <w:right w:w="120" w:type="dxa"/>
-            </w:tcMar>
-            <w:tcBorders>
-              <w:top w:val="single" w:sz="4" w:space="0" w:color="CCCCCC"/>
-              <w:left w:val="single" w:sz="4" w:space="0" w:color="CCCCCC"/>
-              <w:bottom w:val="single" w:sz="4" w:space="0" w:color="CCCCCC"/>
-              <w:right w:val="single" w:sz="4" w:space="0" w:color="CCCCCC"/>
-            </w:tcBorders>
-          </w:tcPr>
-          <w:p>
-            <w:pPr>
-              <w:spacing w:before="40" w:after="40"/>
-            </w:pPr>
-            <w:r>
-              <w:rPr>
-                <w:rFonts w:ascii="Consolas" w:hAnsi="Consolas"/>
-                <w:color w:val="000000"/>
-                <w:sz w:val="18"/>
-              </w:rPr>
-              <w:t>python main.py diagnose data/sample_screenshots/kb-auth-001__01__clean_light.png</w:t>
-            </w:r>
-          </w:p>
-        </w:tc>
-      </w:tr>
-    </w:tbl>
     <w:p>
       <w:pPr>
-        <w:spacing w:after="40"/>
+        <w:spacing w:before="40" w:after="80"/>
+        <w:ind w:left="360"/>
       </w:pPr>
+      <w:r>
+        <w:rPr>
+          <w:rFonts w:ascii="Consolas" w:hAnsi="Consolas"/>
+          <w:color w:val="000000"/>
+          <w:sz w:val="19"/>
+        </w:rPr>
+        <w:t>python main.py diagnose data/sample_screenshots/kb-auth-001__01__clean_light.png</w:t>
+      </w:r>
     </w:p>
     <w:p>
       <w:pPr>
@@ -2200,54 +1904,19 @@
         <w:t>Run OCR on any image and optionally save annotated visual boxes:</w:t>
       </w:r>
     </w:p>
-    <w:tbl>
-      <w:tblPr>
-        <w:tblW w:type="auto" w:w="0"/>
-        <w:jc w:val="center"/>
-        <w:tblLayout w:type="fixed"/>
-        <w:tblLook w:firstColumn="1" w:firstRow="1" w:lastColumn="0" w:lastRow="0" w:noHBand="0" w:noVBand="1" w:val="04A0"/>
-      </w:tblPr>
-      <w:tblGrid>
-        <w:gridCol w:w="9360"/>
-      </w:tblGrid>
-      <w:tr>
-        <w:tc>
-          <w:tcPr>
-            <w:tcW w:type="dxa" w:w="10080"/>
-            <w:shd w:fill="F3F4F6"/>
-            <w:tcMar>
-              <w:top w:w="60" w:type="dxa"/>
-              <w:bottom w:w="60" w:type="dxa"/>
-              <w:left w:w="120" w:type="dxa"/>
-              <w:right w:w="120" w:type="dxa"/>
-            </w:tcMar>
-            <w:tcBorders>
-              <w:top w:val="single" w:sz="4" w:space="0" w:color="CCCCCC"/>
-              <w:left w:val="single" w:sz="4" w:space="0" w:color="CCCCCC"/>
-              <w:bottom w:val="single" w:sz="4" w:space="0" w:color="CCCCCC"/>
-              <w:right w:val="single" w:sz="4" w:space="0" w:color="CCCCCC"/>
-            </w:tcBorders>
-          </w:tcPr>
-          <w:p>
-            <w:pPr>
-              <w:spacing w:before="40" w:after="40"/>
-            </w:pPr>
-            <w:r>
-              <w:rPr>
-                <w:rFonts w:ascii="Consolas" w:hAnsi="Consolas"/>
-                <w:color w:val="000000"/>
-                <w:sz w:val="18"/>
-              </w:rPr>
-              <w:t>python main.py ocr demo_output/sample_invoice.jpg --save-annotated demo_output/result.jpg</w:t>
-            </w:r>
-          </w:p>
-        </w:tc>
-      </w:tr>
-    </w:tbl>
     <w:p>
       <w:pPr>
-        <w:spacing w:after="40"/>
+        <w:spacing w:before="40" w:after="80"/>
+        <w:ind w:left="360"/>
       </w:pPr>
+      <w:r>
+        <w:rPr>
+          <w:rFonts w:ascii="Consolas" w:hAnsi="Consolas"/>
+          <w:color w:val="000000"/>
+          <w:sz w:val="19"/>
+        </w:rPr>
+        <w:t>python main.py ocr demo_output/sample_invoice.jpg --save-annotated demo_output/result.jpg</w:t>
+      </w:r>
     </w:p>
     <w:p>
       <w:pPr>
@@ -2272,54 +1941,19 @@
         <w:t>Ask questions directly against the technical knowledge base:</w:t>
       </w:r>
     </w:p>
-    <w:tbl>
-      <w:tblPr>
-        <w:tblW w:type="auto" w:w="0"/>
-        <w:jc w:val="center"/>
-        <w:tblLayout w:type="fixed"/>
-        <w:tblLook w:firstColumn="1" w:firstRow="1" w:lastColumn="0" w:lastRow="0" w:noHBand="0" w:noVBand="1" w:val="04A0"/>
-      </w:tblPr>
-      <w:tblGrid>
-        <w:gridCol w:w="9360"/>
-      </w:tblGrid>
-      <w:tr>
-        <w:tc>
-          <w:tcPr>
-            <w:tcW w:type="dxa" w:w="10080"/>
-            <w:shd w:fill="F3F4F6"/>
-            <w:tcMar>
-              <w:top w:w="60" w:type="dxa"/>
-              <w:bottom w:w="60" w:type="dxa"/>
-              <w:left w:w="120" w:type="dxa"/>
-              <w:right w:w="120" w:type="dxa"/>
-            </w:tcMar>
-            <w:tcBorders>
-              <w:top w:val="single" w:sz="4" w:space="0" w:color="CCCCCC"/>
-              <w:left w:val="single" w:sz="4" w:space="0" w:color="CCCCCC"/>
-              <w:bottom w:val="single" w:sz="4" w:space="0" w:color="CCCCCC"/>
-              <w:right w:val="single" w:sz="4" w:space="0" w:color="CCCCCC"/>
-            </w:tcBorders>
-          </w:tcPr>
-          <w:p>
-            <w:pPr>
-              <w:spacing w:before="40" w:after="40"/>
-            </w:pPr>
-            <w:r>
-              <w:rPr>
-                <w:rFonts w:ascii="Consolas" w:hAnsi="Consolas"/>
-                <w:color w:val="000000"/>
-                <w:sz w:val="18"/>
-              </w:rPr>
-              <w:t>python main.py rag -q "How do I fix authentication token expired error?"</w:t>
-            </w:r>
-          </w:p>
-        </w:tc>
-      </w:tr>
-    </w:tbl>
     <w:p>
       <w:pPr>
-        <w:spacing w:after="40"/>
+        <w:spacing w:before="40" w:after="80"/>
+        <w:ind w:left="360"/>
       </w:pPr>
+      <w:r>
+        <w:rPr>
+          <w:rFonts w:ascii="Consolas" w:hAnsi="Consolas"/>
+          <w:color w:val="000000"/>
+          <w:sz w:val="19"/>
+        </w:rPr>
+        <w:t>python main.py rag -q "How do I fix authentication token expired error?"</w:t>
+      </w:r>
     </w:p>
     <w:p>
       <w:pPr>
@@ -2349,54 +1983,19 @@
         <w:t>Run all unit and integration tests across the OCR, RAG, and Server subsystems:</w:t>
       </w:r>
     </w:p>
-    <w:tbl>
-      <w:tblPr>
-        <w:tblW w:type="auto" w:w="0"/>
-        <w:jc w:val="center"/>
-        <w:tblLayout w:type="fixed"/>
-        <w:tblLook w:firstColumn="1" w:firstRow="1" w:lastColumn="0" w:lastRow="0" w:noHBand="0" w:noVBand="1" w:val="04A0"/>
-      </w:tblPr>
-      <w:tblGrid>
-        <w:gridCol w:w="9360"/>
-      </w:tblGrid>
-      <w:tr>
-        <w:tc>
-          <w:tcPr>
-            <w:tcW w:type="dxa" w:w="10080"/>
-            <w:shd w:fill="F3F4F6"/>
-            <w:tcMar>
-              <w:top w:w="60" w:type="dxa"/>
-              <w:bottom w:w="60" w:type="dxa"/>
-              <w:left w:w="120" w:type="dxa"/>
-              <w:right w:w="120" w:type="dxa"/>
-            </w:tcMar>
-            <w:tcBorders>
-              <w:top w:val="single" w:sz="4" w:space="0" w:color="CCCCCC"/>
-              <w:left w:val="single" w:sz="4" w:space="0" w:color="CCCCCC"/>
-              <w:bottom w:val="single" w:sz="4" w:space="0" w:color="CCCCCC"/>
-              <w:right w:val="single" w:sz="4" w:space="0" w:color="CCCCCC"/>
-            </w:tcBorders>
-          </w:tcPr>
-          <w:p>
-            <w:pPr>
-              <w:spacing w:before="40" w:after="40"/>
-            </w:pPr>
-            <w:r>
-              <w:rPr>
-                <w:rFonts w:ascii="Consolas" w:hAnsi="Consolas"/>
-                <w:color w:val="000000"/>
-                <w:sz w:val="18"/>
-              </w:rPr>
-              <w:t>pytest</w:t>
-            </w:r>
-          </w:p>
-        </w:tc>
-      </w:tr>
-    </w:tbl>
     <w:p>
       <w:pPr>
-        <w:spacing w:after="40"/>
+        <w:spacing w:before="40" w:after="80"/>
+        <w:ind w:left="360"/>
       </w:pPr>
+      <w:r>
+        <w:rPr>
+          <w:rFonts w:ascii="Consolas" w:hAnsi="Consolas"/>
+          <w:color w:val="000000"/>
+          <w:sz w:val="19"/>
+        </w:rPr>
+        <w:t>pytest</w:t>
+      </w:r>
     </w:p>
     <w:p>
       <w:pPr>
@@ -2411,54 +2010,19 @@
         <w:t>Run the end-to-end knowledge base pipeline test verifying all 12 support scenarios:</w:t>
       </w:r>
     </w:p>
-    <w:tbl>
-      <w:tblPr>
-        <w:tblW w:type="auto" w:w="0"/>
-        <w:jc w:val="center"/>
-        <w:tblLayout w:type="fixed"/>
-        <w:tblLook w:firstColumn="1" w:firstRow="1" w:lastColumn="0" w:lastRow="0" w:noHBand="0" w:noVBand="1" w:val="04A0"/>
-      </w:tblPr>
-      <w:tblGrid>
-        <w:gridCol w:w="9360"/>
-      </w:tblGrid>
-      <w:tr>
-        <w:tc>
-          <w:tcPr>
-            <w:tcW w:type="dxa" w:w="10080"/>
-            <w:shd w:fill="F3F4F6"/>
-            <w:tcMar>
-              <w:top w:w="60" w:type="dxa"/>
-              <w:bottom w:w="60" w:type="dxa"/>
-              <w:left w:w="120" w:type="dxa"/>
-              <w:right w:w="120" w:type="dxa"/>
-            </w:tcMar>
-            <w:tcBorders>
-              <w:top w:val="single" w:sz="4" w:space="0" w:color="CCCCCC"/>
-              <w:left w:val="single" w:sz="4" w:space="0" w:color="CCCCCC"/>
-              <w:bottom w:val="single" w:sz="4" w:space="0" w:color="CCCCCC"/>
-              <w:right w:val="single" w:sz="4" w:space="0" w:color="CCCCCC"/>
-            </w:tcBorders>
-          </w:tcPr>
-          <w:p>
-            <w:pPr>
-              <w:spacing w:before="40" w:after="40"/>
-            </w:pPr>
-            <w:r>
-              <w:rPr>
-                <w:rFonts w:ascii="Consolas" w:hAnsi="Consolas"/>
-                <w:color w:val="000000"/>
-                <w:sz w:val="18"/>
-              </w:rPr>
-              <w:t>python RAG/test_rag_pipeline.py</w:t>
-            </w:r>
-          </w:p>
-        </w:tc>
-      </w:tr>
-    </w:tbl>
     <w:p>
       <w:pPr>
-        <w:spacing w:after="40"/>
+        <w:spacing w:before="40" w:after="80"/>
+        <w:ind w:left="360"/>
       </w:pPr>
+      <w:r>
+        <w:rPr>
+          <w:rFonts w:ascii="Consolas" w:hAnsi="Consolas"/>
+          <w:color w:val="000000"/>
+          <w:sz w:val="19"/>
+        </w:rPr>
+        <w:t>python RAG/test_rag_pipeline.py</w:t>
+      </w:r>
     </w:p>
     <w:p>
       <w:pPr>

</xml_diff>

<commit_message>
docs: update .env keys in solution brief docx and generator
</commit_message>
<xml_diff>
--- a/AI/ChatbotOCR/SOLUTION_BRIEF.docx
+++ b/AI/ChatbotOCR/SOLUTION_BRIEF.docx
@@ -1412,13 +1412,14 @@
       <w:pPr>
         <w:spacing w:after="80"/>
       </w:pPr>
+      <w:r/>
       <w:r>
         <w:rPr>
           <w:rFonts w:ascii="Calibri" w:hAnsi="Calibri"/>
           <w:color w:val="000000"/>
           <w:sz w:val="21"/>
         </w:rPr>
-        <w:t>Copy .env.example to .env and provide your Azure OpenAI credentials (API key, endpoint, model deployment name):</w:t>
+        <w:t>Copy .env.example to .env and configure the required environment variables for the LLM and vector database:</w:t>
       </w:r>
     </w:p>
     <w:p>
@@ -1426,6 +1427,7 @@
         <w:spacing w:before="40" w:after="80"/>
         <w:ind w:left="360"/>
       </w:pPr>
+      <w:r/>
       <w:r>
         <w:rPr>
           <w:rFonts w:ascii="Consolas" w:hAnsi="Consolas"/>
@@ -1433,22 +1435,18 @@
           <w:sz w:val="19"/>
         </w:rPr>
         <w:t>cp .env.example .env</w:t>
-      </w:r>
-      <w:r>
-        <w:rPr>
-          <w:rFonts w:ascii="Consolas" w:hAnsi="Consolas"/>
-          <w:color w:val="000000"/>
-          <w:sz w:val="19"/>
-        </w:rPr>
         <w:br/>
-      </w:r>
-      <w:r>
-        <w:rPr>
-          <w:rFonts w:ascii="Consolas" w:hAnsi="Consolas"/>
-          <w:color w:val="000000"/>
-          <w:sz w:val="19"/>
-        </w:rPr>
-        <w:t># Edit .env with your AZURE_OPENAI_API_KEY and AZURE_OPENAI_ENDPOINT</w:t>
+        <w:t># Configure the required keys in .env:</w:t>
+        <w:br/>
+        <w:t># OPENAI_API_KEY="your-api-key"</w:t>
+        <w:br/>
+        <w:t># OPENAI_BASE_URL="https://your-resource.openai.azure.com/openai/v1"</w:t>
+        <w:br/>
+        <w:t># MODEL_NAME="gpt-4o-mini"</w:t>
+        <w:br/>
+        <w:t># VECTOR_STORE_TYPE="milvus_lite"</w:t>
+        <w:br/>
+        <w:t># MILVUS_DB_PATH="./data/milvus_lite.db"</w:t>
       </w:r>
     </w:p>
     <w:p>

</xml_diff>

<commit_message>
docs: update report env configuration keys and sync downloads docx
</commit_message>
<xml_diff>
--- a/AI/ChatbotOCR/SOLUTION_BRIEF.docx
+++ b/AI/ChatbotOCR/SOLUTION_BRIEF.docx
@@ -1419,7 +1419,7 @@
           <w:color w:val="000000"/>
           <w:sz w:val="21"/>
         </w:rPr>
-        <w:t>Copy .env.example to .env and configure the required environment variables for the LLM and vector database:</w:t>
+        <w:t>Create the local environment configuration file by copying .env.example to .env:</w:t>
       </w:r>
     </w:p>
     <w:p>
@@ -1436,17 +1436,19 @@
         </w:rPr>
         <w:t>cp .env.example .env</w:t>
         <w:br/>
-        <w:t># Configure the required keys in .env:</w:t>
+        <w:t># Edit .env with your environment keys:</w:t>
         <w:br/>
-        <w:t># OPENAI_API_KEY="your-api-key"</w:t>
+        <w:t>OPENAI_API_KEY="your-api-key"</w:t>
         <w:br/>
-        <w:t># OPENAI_BASE_URL="https://your-resource.openai.azure.com/openai/v1"</w:t>
+        <w:t>OPENAI_BASE_URL="https://your-resource.openai.azure.com/openai/v1"</w:t>
         <w:br/>
-        <w:t># MODEL_NAME="gpt-4o-mini"</w:t>
+        <w:t>MODEL_NAME="gpt-4o-mini"</w:t>
         <w:br/>
-        <w:t># VECTOR_STORE_TYPE="milvus_lite"</w:t>
+        <w:t>EMBEDDING_MODEL="all-MiniLM-L6-v2"</w:t>
         <w:br/>
-        <w:t># MILVUS_DB_PATH="./data/milvus_lite.db"</w:t>
+        <w:t>VECTOR_STORE_TYPE="milvus_lite"</w:t>
+        <w:br/>
+        <w:t>MILVUS_DB_PATH="./data/milvus_lite.db"</w:t>
       </w:r>
     </w:p>
     <w:p>

</xml_diff>

<commit_message>
feat(rag): switch to openai text-embedding-3-small and comment out local embedding packages
</commit_message>
<xml_diff>
--- a/AI/ChatbotOCR/SOLUTION_BRIEF.docx
+++ b/AI/ChatbotOCR/SOLUTION_BRIEF.docx
@@ -556,7 +556,7 @@
           <w:color w:val="000000"/>
           <w:sz w:val="21"/>
         </w:rPr>
-        <w:t>The sanitized diagnostic summary is converted into a vector embedding using a dense embedding model (all-MiniLM-L6-v2). The system then searches against Milvus Lite, an embedded local vector database containing 12 pre-loaded enterprise support articles (covering authentication, database connection issues, network timeouts, storage limits, and server errors).</w:t>
+        <w:t>The sanitized diagnostic summary is converted into a vector embedding using OpenAI's dense embedding model (text-embedding-3-small). The system then searches against Milvus Lite, an embedded local vector database containing 12 pre-loaded enterprise support articles (covering authentication, database connection issues, network timeouts, storage limits, and server errors).</w:t>
       </w:r>
     </w:p>
     <w:p>
@@ -1713,7 +1713,7 @@
         <w:br/>
         <w:t>MODEL_NAME="gpt-4o-mini"</w:t>
         <w:br/>
-        <w:t>EMBEDDING_MODEL="all-MiniLM-L6-v2"</w:t>
+        <w:t>EMBEDDING_MODEL="text-embedding-3-small"</w:t>
         <w:br/>
         <w:t>VECTOR_STORE_TYPE="milvus_lite"</w:t>
         <w:br/>

</xml_diff>

<commit_message>
docs: move execution instructions to README.md, make docx pure solution brief, and exclude REQUIREMENT.md from zip
</commit_message>
<xml_diff>
--- a/AI/ChatbotOCR/SOLUTION_BRIEF.docx
+++ b/AI/ChatbotOCR/SOLUTION_BRIEF.docx
@@ -1550,549 +1550,7 @@
           <w:color w:val="000000"/>
           <w:sz w:val="26"/>
         </w:rPr>
-        <w:t>5. How to Run This Project</w:t>
-      </w:r>
-    </w:p>
-    <w:p>
-      <w:pPr>
-        <w:spacing w:before="0" w:after="80" w:line="276" w:lineRule="auto"/>
-      </w:pPr>
-      <w:r>
-        <w:rPr>
-          <w:rFonts w:ascii="Calibri" w:hAnsi="Calibri"/>
-          <w:color w:val="000000"/>
-          <w:sz w:val="21"/>
-        </w:rPr>
-        <w:t>The project is packaged with a unified CLI entrypoint (main.py) and a FastAPI web server, enabling straightforward setup and execution.</w:t>
-      </w:r>
-    </w:p>
-    <w:p>
-      <w:pPr>
-        <w:keepNext/>
-        <w:spacing w:before="200" w:after="60"/>
-      </w:pPr>
-      <w:r>
-        <w:rPr>
-          <w:rFonts w:ascii="Calibri" w:hAnsi="Calibri"/>
-          <w:b/>
-          <w:color w:val="000000"/>
-          <w:sz w:val="23"/>
-        </w:rPr>
-        <w:t>5.1 Prerequisites &amp; Environment Setup</w:t>
-      </w:r>
-    </w:p>
-    <w:p>
-      <w:pPr>
-        <w:spacing w:before="0" w:after="80" w:line="276" w:lineRule="auto"/>
-      </w:pPr>
-      <w:r>
-        <w:rPr>
-          <w:rFonts w:ascii="Calibri" w:hAnsi="Calibri"/>
-          <w:color w:val="000000"/>
-          <w:sz w:val="21"/>
-        </w:rPr>
-        <w:t>1. Clone the repository and enter the project directory:</w:t>
-      </w:r>
-    </w:p>
-    <w:p>
-      <w:pPr>
-        <w:spacing w:before="40" w:after="80"/>
-        <w:ind w:left="360"/>
-      </w:pPr>
-      <w:r>
-        <w:rPr>
-          <w:rFonts w:ascii="Consolas" w:hAnsi="Consolas"/>
-          <w:color w:val="000000"/>
-          <w:sz w:val="19"/>
-        </w:rPr>
-        <w:t>git clone https://github.com/NVKQ2022/MVP.git</w:t>
-        <w:br/>
-        <w:t>cd MVP/AI/ChatbotOCR</w:t>
-      </w:r>
-    </w:p>
-    <w:p>
-      <w:pPr>
-        <w:spacing w:before="0" w:after="80" w:line="276" w:lineRule="auto"/>
-      </w:pPr>
-      <w:r>
-        <w:rPr>
-          <w:rFonts w:ascii="Calibri" w:hAnsi="Calibri"/>
-          <w:color w:val="000000"/>
-          <w:sz w:val="21"/>
-        </w:rPr>
-        <w:t>2. Create and activate a Python virtual environment (Python 3.10+ or 3.12):</w:t>
-      </w:r>
-    </w:p>
-    <w:p>
-      <w:pPr>
-        <w:spacing w:before="40" w:after="80"/>
-        <w:ind w:left="360"/>
-      </w:pPr>
-      <w:r>
-        <w:rPr>
-          <w:rFonts w:ascii="Consolas" w:hAnsi="Consolas"/>
-          <w:color w:val="000000"/>
-          <w:sz w:val="19"/>
-        </w:rPr>
-        <w:t>python3 -m venv venv</w:t>
-        <w:br/>
-        <w:t>source venv/bin/activate    # On Windows: venv\Scripts\activate</w:t>
-      </w:r>
-    </w:p>
-    <w:p>
-      <w:pPr>
-        <w:spacing w:before="0" w:after="80" w:line="276" w:lineRule="auto"/>
-      </w:pPr>
-      <w:r>
-        <w:rPr>
-          <w:rFonts w:ascii="Calibri" w:hAnsi="Calibri"/>
-          <w:color w:val="000000"/>
-          <w:sz w:val="21"/>
-        </w:rPr>
-        <w:t>3. Install the project dependencies:</w:t>
-      </w:r>
-    </w:p>
-    <w:p>
-      <w:pPr>
-        <w:spacing w:before="40" w:after="80"/>
-        <w:ind w:left="360"/>
-      </w:pPr>
-      <w:r>
-        <w:rPr>
-          <w:rFonts w:ascii="Consolas" w:hAnsi="Consolas"/>
-          <w:color w:val="000000"/>
-          <w:sz w:val="19"/>
-        </w:rPr>
-        <w:t>pip install -r requirements.txt</w:t>
-      </w:r>
-    </w:p>
-    <w:p>
-      <w:pPr>
-        <w:spacing w:before="0" w:after="80" w:line="276" w:lineRule="auto"/>
-      </w:pPr>
-      <w:r>
-        <w:rPr>
-          <w:rFonts w:ascii="Calibri" w:hAnsi="Calibri"/>
-          <w:color w:val="000000"/>
-          <w:sz w:val="21"/>
-        </w:rPr>
-        <w:t>4. Configure environment variables (.env file):</w:t>
-      </w:r>
-    </w:p>
-    <w:p>
-      <w:pPr>
-        <w:spacing w:before="0" w:after="80" w:line="276" w:lineRule="auto"/>
-      </w:pPr>
-      <w:r>
-        <w:rPr>
-          <w:rFonts w:ascii="Calibri" w:hAnsi="Calibri"/>
-          <w:color w:val="000000"/>
-          <w:sz w:val="21"/>
-        </w:rPr>
-        <w:t>Create the local environment configuration file by copying .env.example to .env:</w:t>
-      </w:r>
-    </w:p>
-    <w:p>
-      <w:pPr>
-        <w:spacing w:before="40" w:after="80"/>
-        <w:ind w:left="360"/>
-      </w:pPr>
-      <w:r>
-        <w:rPr>
-          <w:rFonts w:ascii="Consolas" w:hAnsi="Consolas"/>
-          <w:color w:val="000000"/>
-          <w:sz w:val="19"/>
-        </w:rPr>
-        <w:t>cp .env.example .env</w:t>
-        <w:br/>
-        <w:t># Edit .env with your environment keys:</w:t>
-        <w:br/>
-        <w:t>OPENAI_API_KEY="your-api-key"</w:t>
-        <w:br/>
-        <w:t>OPENAI_BASE_URL="https://your-resource.openai.azure.com/openai/v1"</w:t>
-        <w:br/>
-        <w:t>MODEL_NAME="gpt-4o-mini"</w:t>
-        <w:br/>
-        <w:t>EMBEDDING_MODEL="text-embedding-3-small"</w:t>
-        <w:br/>
-        <w:t>VECTOR_STORE_TYPE="milvus_lite"</w:t>
-        <w:br/>
-        <w:t>MILVUS_DB_PATH="./data/milvus_lite.db"</w:t>
-      </w:r>
-    </w:p>
-    <w:p>
-      <w:pPr>
-        <w:spacing w:before="0" w:after="80" w:line="276" w:lineRule="auto"/>
-      </w:pPr>
-      <w:r>
-        <w:rPr>
-          <w:rFonts w:ascii="Calibri" w:hAnsi="Calibri"/>
-          <w:color w:val="000000"/>
-          <w:sz w:val="21"/>
-        </w:rPr>
-        <w:t>5. (Optional) Ingest or Re-index the Knowledge Base:</w:t>
-      </w:r>
-    </w:p>
-    <w:p>
-      <w:pPr>
-        <w:spacing w:before="0" w:after="80" w:line="276" w:lineRule="auto"/>
-      </w:pPr>
-      <w:r>
-        <w:rPr>
-          <w:rFonts w:ascii="Calibri" w:hAnsi="Calibri"/>
-          <w:color w:val="000000"/>
-          <w:sz w:val="21"/>
-        </w:rPr>
-        <w:t>The database is already pre-indexed in data/milvus_lite.db and automatically self-heals if empty. To manually re-index documents from data/kb_documents/:</w:t>
-      </w:r>
-    </w:p>
-    <w:p>
-      <w:pPr>
-        <w:spacing w:before="40" w:after="80"/>
-        <w:ind w:left="360"/>
-      </w:pPr>
-      <w:r>
-        <w:rPr>
-          <w:rFonts w:ascii="Consolas" w:hAnsi="Consolas"/>
-          <w:color w:val="000000"/>
-          <w:sz w:val="19"/>
-        </w:rPr>
-        <w:t>python main.py ingest</w:t>
-        <w:br/>
-        <w:t># Or to clear existing records and rebuild from scratch:</w:t>
-        <w:br/>
-        <w:t>python main.py ingest --force</w:t>
-      </w:r>
-    </w:p>
-    <w:p>
-      <w:pPr>
-        <w:keepNext/>
-        <w:spacing w:before="200" w:after="60"/>
-      </w:pPr>
-      <w:r>
-        <w:rPr>
-          <w:rFonts w:ascii="Calibri" w:hAnsi="Calibri"/>
-          <w:b/>
-          <w:color w:val="000000"/>
-          <w:sz w:val="23"/>
-        </w:rPr>
-        <w:t>5.2 Starting the Web Chat Application</w:t>
-      </w:r>
-    </w:p>
-    <w:p>
-      <w:pPr>
-        <w:spacing w:before="0" w:after="80" w:line="276" w:lineRule="auto"/>
-      </w:pPr>
-      <w:r>
-        <w:rPr>
-          <w:rFonts w:ascii="Calibri" w:hAnsi="Calibri"/>
-          <w:color w:val="000000"/>
-          <w:sz w:val="21"/>
-        </w:rPr>
-        <w:t>Launch the application using the root runner:</w:t>
-      </w:r>
-    </w:p>
-    <w:p>
-      <w:pPr>
-        <w:spacing w:before="40" w:after="80"/>
-        <w:ind w:left="360"/>
-      </w:pPr>
-      <w:r>
-        <w:rPr>
-          <w:rFonts w:ascii="Consolas" w:hAnsi="Consolas"/>
-          <w:color w:val="000000"/>
-          <w:sz w:val="19"/>
-        </w:rPr>
-        <w:t>python main.py</w:t>
-        <w:br/>
-        <w:t># Or explicitly: python main.py server --host 0.0.0.0 --port 8000</w:t>
-      </w:r>
-    </w:p>
-    <w:p>
-      <w:pPr>
-        <w:spacing w:before="0" w:after="80" w:line="276" w:lineRule="auto"/>
-      </w:pPr>
-      <w:r>
-        <w:rPr>
-          <w:rFonts w:ascii="Calibri" w:hAnsi="Calibri"/>
-          <w:color w:val="000000"/>
-          <w:sz w:val="21"/>
-        </w:rPr>
-        <w:t>Once started, open your web browser to:</w:t>
-      </w:r>
-    </w:p>
-    <w:p>
-      <w:pPr>
-        <w:pStyle w:val="ListBullet"/>
-        <w:spacing w:before="0" w:after="50" w:line="276" w:lineRule="auto"/>
-      </w:pPr>
-      <w:r>
-        <w:rPr>
-          <w:rFonts w:ascii="Calibri" w:hAnsi="Calibri"/>
-          <w:b/>
-          <w:color w:val="000000"/>
-          <w:sz w:val="20"/>
-        </w:rPr>
-        <w:t xml:space="preserve">Web Chat Interface: </w:t>
-      </w:r>
-      <w:r>
-        <w:rPr>
-          <w:rFonts w:ascii="Calibri" w:hAnsi="Calibri"/>
-          <w:color w:val="000000"/>
-          <w:sz w:val="20"/>
-        </w:rPr>
-        <w:t>http://localhost:8000 — Interactive single-page support chatbot UI with drag-and-drop screenshot upload.</w:t>
-      </w:r>
-    </w:p>
-    <w:p>
-      <w:pPr>
-        <w:pStyle w:val="ListBullet"/>
-        <w:spacing w:before="0" w:after="50" w:line="276" w:lineRule="auto"/>
-      </w:pPr>
-      <w:r>
-        <w:rPr>
-          <w:rFonts w:ascii="Calibri" w:hAnsi="Calibri"/>
-          <w:b/>
-          <w:color w:val="000000"/>
-          <w:sz w:val="20"/>
-        </w:rPr>
-        <w:t xml:space="preserve">API Documentation: </w:t>
-      </w:r>
-      <w:r>
-        <w:rPr>
-          <w:rFonts w:ascii="Calibri" w:hAnsi="Calibri"/>
-          <w:color w:val="000000"/>
-          <w:sz w:val="20"/>
-        </w:rPr>
-        <w:t>http://localhost:8000/docs — Interactive OpenAPI / Swagger documentation for testing REST endpoints directly.</w:t>
-      </w:r>
-    </w:p>
-    <w:p>
-      <w:pPr>
-        <w:keepNext/>
-        <w:spacing w:before="200" w:after="60"/>
-      </w:pPr>
-      <w:r>
-        <w:rPr>
-          <w:rFonts w:ascii="Calibri" w:hAnsi="Calibri"/>
-          <w:b/>
-          <w:color w:val="000000"/>
-          <w:sz w:val="23"/>
-        </w:rPr>
-        <w:t>5.3 Running End-to-End Terminal Diagnosis (CLI)</w:t>
-      </w:r>
-    </w:p>
-    <w:p>
-      <w:pPr>
-        <w:spacing w:before="0" w:after="80" w:line="276" w:lineRule="auto"/>
-      </w:pPr>
-      <w:r>
-        <w:rPr>
-          <w:rFonts w:ascii="Calibri" w:hAnsi="Calibri"/>
-          <w:color w:val="000000"/>
-          <w:sz w:val="21"/>
-        </w:rPr>
-        <w:t>You can diagnose an error screenshot directly from the terminal without opening a browser:</w:t>
-      </w:r>
-    </w:p>
-    <w:p>
-      <w:pPr>
-        <w:spacing w:before="40" w:after="80"/>
-        <w:ind w:left="360"/>
-      </w:pPr>
-      <w:r>
-        <w:rPr>
-          <w:rFonts w:ascii="Consolas" w:hAnsi="Consolas"/>
-          <w:color w:val="000000"/>
-          <w:sz w:val="19"/>
-        </w:rPr>
-        <w:t>python main.py diagnose data/sample_screenshots/kb-auth-001__01__clean_light.png</w:t>
-      </w:r>
-    </w:p>
-    <w:p>
-      <w:pPr>
-        <w:spacing w:before="0" w:after="80" w:line="276" w:lineRule="auto"/>
-      </w:pPr>
-      <w:r>
-        <w:rPr>
-          <w:rFonts w:ascii="Calibri" w:hAnsi="Calibri"/>
-          <w:color w:val="000000"/>
-          <w:sz w:val="21"/>
-        </w:rPr>
-        <w:t>This command executes the full pipeline in the terminal: extracts text using PaddleOCR, searches Milvus Lite, and prints the grounded resolution along with latency and confidence metrics.</w:t>
-      </w:r>
-    </w:p>
-    <w:p>
-      <w:pPr>
-        <w:keepNext/>
-        <w:spacing w:before="200" w:after="60"/>
-      </w:pPr>
-      <w:r>
-        <w:rPr>
-          <w:rFonts w:ascii="Calibri" w:hAnsi="Calibri"/>
-          <w:b/>
-          <w:color w:val="000000"/>
-          <w:sz w:val="23"/>
-        </w:rPr>
-        <w:t>5.4 Standalone OCR and RAG Commands</w:t>
-      </w:r>
-    </w:p>
-    <w:p>
-      <w:pPr>
-        <w:pStyle w:val="ListBullet"/>
-        <w:spacing w:before="0" w:after="50" w:line="276" w:lineRule="auto"/>
-      </w:pPr>
-      <w:r>
-        <w:rPr>
-          <w:rFonts w:ascii="Calibri" w:hAnsi="Calibri"/>
-          <w:b/>
-          <w:color w:val="000000"/>
-          <w:sz w:val="20"/>
-        </w:rPr>
-        <w:t xml:space="preserve">Standalone OCR: </w:t>
-      </w:r>
-      <w:r>
-        <w:rPr>
-          <w:rFonts w:ascii="Calibri" w:hAnsi="Calibri"/>
-          <w:color w:val="000000"/>
-          <w:sz w:val="20"/>
-        </w:rPr>
-        <w:t>Run OCR on any image and optionally save annotated visual boxes:</w:t>
-      </w:r>
-    </w:p>
-    <w:p>
-      <w:pPr>
-        <w:spacing w:before="40" w:after="80"/>
-        <w:ind w:left="360"/>
-      </w:pPr>
-      <w:r>
-        <w:rPr>
-          <w:rFonts w:ascii="Consolas" w:hAnsi="Consolas"/>
-          <w:color w:val="000000"/>
-          <w:sz w:val="19"/>
-        </w:rPr>
-        <w:t>python main.py ocr demo_output/sample_invoice.jpg --save-annotated demo_output/result.jpg</w:t>
-      </w:r>
-    </w:p>
-    <w:p>
-      <w:pPr>
-        <w:pStyle w:val="ListBullet"/>
-        <w:spacing w:before="0" w:after="50" w:line="276" w:lineRule="auto"/>
-      </w:pPr>
-      <w:r>
-        <w:rPr>
-          <w:rFonts w:ascii="Calibri" w:hAnsi="Calibri"/>
-          <w:b/>
-          <w:color w:val="000000"/>
-          <w:sz w:val="20"/>
-        </w:rPr>
-        <w:t xml:space="preserve">Standalone Knowledge Query: </w:t>
-      </w:r>
-      <w:r>
-        <w:rPr>
-          <w:rFonts w:ascii="Calibri" w:hAnsi="Calibri"/>
-          <w:color w:val="000000"/>
-          <w:sz w:val="20"/>
-        </w:rPr>
-        <w:t>Ask questions directly against the technical knowledge base:</w:t>
-      </w:r>
-    </w:p>
-    <w:p>
-      <w:pPr>
-        <w:spacing w:before="40" w:after="80"/>
-        <w:ind w:left="360"/>
-      </w:pPr>
-      <w:r>
-        <w:rPr>
-          <w:rFonts w:ascii="Consolas" w:hAnsi="Consolas"/>
-          <w:color w:val="000000"/>
-          <w:sz w:val="19"/>
-        </w:rPr>
-        <w:t>python main.py rag -q "How do I fix authentication token expired error?"</w:t>
-      </w:r>
-    </w:p>
-    <w:p>
-      <w:pPr>
-        <w:keepNext/>
-        <w:spacing w:before="200" w:after="60"/>
-      </w:pPr>
-      <w:r>
-        <w:rPr>
-          <w:rFonts w:ascii="Calibri" w:hAnsi="Calibri"/>
-          <w:b/>
-          <w:color w:val="000000"/>
-          <w:sz w:val="23"/>
-        </w:rPr>
-        <w:t>5.5 Running the Automated Test Suite</w:t>
-      </w:r>
-    </w:p>
-    <w:p>
-      <w:pPr>
-        <w:spacing w:before="0" w:after="80" w:line="276" w:lineRule="auto"/>
-      </w:pPr>
-      <w:r>
-        <w:rPr>
-          <w:rFonts w:ascii="Calibri" w:hAnsi="Calibri"/>
-          <w:color w:val="000000"/>
-          <w:sz w:val="21"/>
-        </w:rPr>
-        <w:t>Run all unit and integration tests across the OCR, RAG, and Server subsystems:</w:t>
-      </w:r>
-    </w:p>
-    <w:p>
-      <w:pPr>
-        <w:spacing w:before="40" w:after="80"/>
-        <w:ind w:left="360"/>
-      </w:pPr>
-      <w:r>
-        <w:rPr>
-          <w:rFonts w:ascii="Consolas" w:hAnsi="Consolas"/>
-          <w:color w:val="000000"/>
-          <w:sz w:val="19"/>
-        </w:rPr>
-        <w:t>pytest</w:t>
-      </w:r>
-    </w:p>
-    <w:p>
-      <w:pPr>
-        <w:spacing w:before="0" w:after="80" w:line="276" w:lineRule="auto"/>
-      </w:pPr>
-      <w:r>
-        <w:rPr>
-          <w:rFonts w:ascii="Calibri" w:hAnsi="Calibri"/>
-          <w:color w:val="000000"/>
-          <w:sz w:val="21"/>
-        </w:rPr>
-        <w:t>Run the end-to-end knowledge base pipeline test verifying all 12 support scenarios:</w:t>
-      </w:r>
-    </w:p>
-    <w:p>
-      <w:pPr>
-        <w:spacing w:before="40" w:after="80"/>
-        <w:ind w:left="360"/>
-      </w:pPr>
-      <w:r>
-        <w:rPr>
-          <w:rFonts w:ascii="Consolas" w:hAnsi="Consolas"/>
-          <w:color w:val="000000"/>
-          <w:sz w:val="19"/>
-        </w:rPr>
-        <w:t>python RAG/test_rag_pipeline.py</w:t>
-      </w:r>
-    </w:p>
-    <w:p>
-      <w:pPr>
-        <w:keepNext/>
-        <w:spacing w:before="280" w:after="80"/>
-      </w:pPr>
-      <w:r>
-        <w:rPr>
-          <w:rFonts w:ascii="Calibri" w:hAnsi="Calibri"/>
-          <w:b/>
-          <w:color w:val="000000"/>
-          <w:sz w:val="26"/>
-        </w:rPr>
-        <w:t>6. Verification &amp; Robustness Results</w:t>
+        <w:t>5. Verification &amp; Robustness Results</w:t>
       </w:r>
     </w:p>
     <w:p>

</xml_diff>